<commit_message>
feat: Úkol 1 – komponenta FilmCard s typed props
</commit_message>
<xml_diff>
--- a/ReactJs (2).docx
+++ b/ReactJs (2).docx
@@ -62,14 +62,27 @@
         <w:t>Body</w:t>
       </w:r>
     </w:p>
+    <w:p>
+      <w:r>
+        <w:t>První den: 10b</w:t>
+      </w:r>
+    </w:p>
+    <w:p>
+      <w:r>
+        <w:t>Druhý den: 25b</w:t>
+      </w:r>
+    </w:p>
+    <w:p>
+      <w:r>
+        <w:t>Třetí den: 15b</w:t>
+      </w:r>
+    </w:p>
+    <w:p>
+      <w:r>
+        <w:t>Semestrální Práce: 50b</w:t>
+      </w:r>
+    </w:p>
     <w:p/>
-    <w:p/>
-    <w:p>
-      <w:r>
-        <w:t>Semestrální Práce: 50b</w:t>
-      </w:r>
-    </w:p>
-    <w:p/>
     <w:p>
       <w:pPr>
         <w:pStyle w:val="Nadpis1"/>
@@ -83,8 +96,13 @@
         <w:pStyle w:val="Nadpis2"/>
       </w:pPr>
       <w:r>
-        <w:t>Build a Transpilace</w:t>
-      </w:r>
+        <w:t xml:space="preserve">Build a </w:t>
+      </w:r>
+      <w:proofErr w:type="spellStart"/>
+      <w:r>
+        <w:t>Transpilace</w:t>
+      </w:r>
+      <w:proofErr w:type="spellEnd"/>
     </w:p>
     <w:p>
       <w:r>
@@ -95,9 +113,11 @@
       <w:pPr>
         <w:pStyle w:val="Nadpis1"/>
       </w:pPr>
+      <w:proofErr w:type="spellStart"/>
       <w:r>
         <w:t>Typescript</w:t>
       </w:r>
+      <w:proofErr w:type="spellEnd"/>
     </w:p>
     <w:p>
       <w:pPr>
@@ -119,7 +139,15 @@
     </w:p>
     <w:p>
       <w:r>
-        <w:t>Umožňuje autocomplete v IDE.</w:t>
+        <w:t xml:space="preserve">Umožňuje </w:t>
+      </w:r>
+      <w:proofErr w:type="spellStart"/>
+      <w:r>
+        <w:t>autocomplete</w:t>
+      </w:r>
+      <w:proofErr w:type="spellEnd"/>
+      <w:r>
+        <w:t xml:space="preserve"> v IDE.</w:t>
       </w:r>
     </w:p>
     <w:p>
@@ -129,6 +157,7 @@
     </w:p>
     <w:p>
       <w:r>
+        <w:lastRenderedPageBreak/>
         <w:drawing>
           <wp:inline distT="0" distB="0" distL="0" distR="0" wp14:anchorId="101FC4D2" wp14:editId="3D35E390">
             <wp:extent cx="5760720" cy="1831340"/>
@@ -171,7 +200,6 @@
         <w:pStyle w:val="Nadpis2"/>
       </w:pPr>
       <w:r>
-        <w:lastRenderedPageBreak/>
         <w:t>Základní typy a notace</w:t>
       </w:r>
     </w:p>
@@ -224,7 +252,31 @@
     </w:p>
     <w:p>
       <w:r>
-        <w:t>Interface popisuje, jak má vypadat objekt. Objekt je hodnota, která obsahuje pojmenované vlastnosti, například uživatel může mít id, name a email. Interface tedy neurčuje konkrétního uživatele, ale pravidla pro to, jaké vlastnosti má uživatelský objekt mít. V Reactu se interface často používá pro props, tedy data, která posíláme z rodičovské komponenty do dětské komponenty.</w:t>
+        <w:t xml:space="preserve">Interface popisuje, jak má vypadat objekt. Objekt je hodnota, která obsahuje pojmenované vlastnosti, například uživatel může mít id, </w:t>
+      </w:r>
+      <w:proofErr w:type="spellStart"/>
+      <w:r>
+        <w:t>name</w:t>
+      </w:r>
+      <w:proofErr w:type="spellEnd"/>
+      <w:r>
+        <w:t xml:space="preserve"> a email. Interface tedy neurčuje konkrétního uživatele, ale pravidla pro to, jaké vlastnosti má uživatelský objekt mít. V </w:t>
+      </w:r>
+      <w:proofErr w:type="spellStart"/>
+      <w:r>
+        <w:t>Reactu</w:t>
+      </w:r>
+      <w:proofErr w:type="spellEnd"/>
+      <w:r>
+        <w:t xml:space="preserve"> se interface často používá pro </w:t>
+      </w:r>
+      <w:proofErr w:type="spellStart"/>
+      <w:r>
+        <w:t>props</w:t>
+      </w:r>
+      <w:proofErr w:type="spellEnd"/>
+      <w:r>
+        <w:t>, tedy data, která posíláme z rodičovské komponenty do dětské komponenty.</w:t>
       </w:r>
     </w:p>
     <w:p>
@@ -280,12 +332,34 @@
         <w:pStyle w:val="Nadpis2"/>
       </w:pPr>
       <w:r>
-        <w:t>Type aliases</w:t>
-      </w:r>
-    </w:p>
-    <w:p>
-      <w:r>
-        <w:t>Umožňuje definovat, jakých konkrétních hodot proměnné nabívají.</w:t>
+        <w:lastRenderedPageBreak/>
+        <w:t xml:space="preserve">Type </w:t>
+      </w:r>
+      <w:proofErr w:type="spellStart"/>
+      <w:r>
+        <w:t>aliases</w:t>
+      </w:r>
+      <w:proofErr w:type="spellEnd"/>
+    </w:p>
+    <w:p>
+      <w:r>
+        <w:t xml:space="preserve">Umožňuje definovat, jakých konkrétních </w:t>
+      </w:r>
+      <w:proofErr w:type="spellStart"/>
+      <w:r>
+        <w:t>hodot</w:t>
+      </w:r>
+      <w:proofErr w:type="spellEnd"/>
+      <w:r>
+        <w:t xml:space="preserve"> proměnné </w:t>
+      </w:r>
+      <w:proofErr w:type="spellStart"/>
+      <w:r>
+        <w:t>nabívají</w:t>
+      </w:r>
+      <w:proofErr w:type="spellEnd"/>
+      <w:r>
+        <w:t>.</w:t>
       </w:r>
     </w:p>
     <w:p>
@@ -327,8 +401,1517 @@
         </w:drawing>
       </w:r>
     </w:p>
+    <w:p>
+      <w:pPr>
+        <w:pStyle w:val="Nadpis1"/>
+      </w:pPr>
+      <w:proofErr w:type="spellStart"/>
+      <w:r>
+        <w:t>React</w:t>
+      </w:r>
+      <w:proofErr w:type="spellEnd"/>
+      <w:r>
+        <w:t xml:space="preserve"> </w:t>
+      </w:r>
+      <w:proofErr w:type="spellStart"/>
+      <w:r>
+        <w:t>best</w:t>
+      </w:r>
+      <w:proofErr w:type="spellEnd"/>
+      <w:r>
+        <w:t xml:space="preserve"> </w:t>
+      </w:r>
+      <w:proofErr w:type="spellStart"/>
+      <w:r>
+        <w:t>practices</w:t>
+      </w:r>
+      <w:proofErr w:type="spellEnd"/>
+    </w:p>
+    <w:p>
+      <w:pPr>
+        <w:pStyle w:val="Nadpis2"/>
+      </w:pPr>
+      <w:proofErr w:type="spellStart"/>
+      <w:r>
+        <w:t>Naming</w:t>
+      </w:r>
+      <w:proofErr w:type="spellEnd"/>
+    </w:p>
+    <w:tbl>
+      <w:tblPr>
+        <w:tblW w:w="9498" w:type="dxa"/>
+        <w:tblInd w:w="-284" w:type="dxa"/>
+        <w:shd w:val="clear" w:color="auto" w:fill="F1EFE8"/>
+        <w:tblCellMar>
+          <w:left w:w="0" w:type="dxa"/>
+          <w:right w:w="0" w:type="dxa"/>
+        </w:tblCellMar>
+        <w:tblLook w:val="04A0" w:firstRow="1" w:lastRow="0" w:firstColumn="1" w:lastColumn="0" w:noHBand="0" w:noVBand="1"/>
+      </w:tblPr>
+      <w:tblGrid>
+        <w:gridCol w:w="2127"/>
+        <w:gridCol w:w="3139"/>
+        <w:gridCol w:w="4232"/>
+      </w:tblGrid>
+      <w:tr>
+        <w:tc>
+          <w:tcPr>
+            <w:tcW w:w="2127" w:type="dxa"/>
+            <w:tcBorders>
+              <w:bottom w:val="single" w:sz="4" w:space="0" w:color="D3D1C7"/>
+            </w:tcBorders>
+            <w:shd w:val="clear" w:color="auto" w:fill="F1EFE8"/>
+            <w:vAlign w:val="center"/>
+            <w:hideMark/>
+          </w:tcPr>
+          <w:p>
+            <w:pPr>
+              <w:jc w:val="center"/>
+            </w:pPr>
+            <w:proofErr w:type="spellStart"/>
+            <w:r>
+              <w:t>React</w:t>
+            </w:r>
+            <w:proofErr w:type="spellEnd"/>
+            <w:r>
+              <w:t xml:space="preserve"> komponenta</w:t>
+            </w:r>
+          </w:p>
+        </w:tc>
+        <w:tc>
+          <w:tcPr>
+            <w:tcW w:w="3139" w:type="dxa"/>
+            <w:tcBorders>
+              <w:bottom w:val="single" w:sz="4" w:space="0" w:color="D3D1C7"/>
+            </w:tcBorders>
+            <w:shd w:val="clear" w:color="auto" w:fill="F1EFE8"/>
+            <w:vAlign w:val="center"/>
+            <w:hideMark/>
+          </w:tcPr>
+          <w:p>
+            <w:pPr>
+              <w:jc w:val="center"/>
+            </w:pPr>
+            <w:proofErr w:type="spellStart"/>
+            <w:r>
+              <w:t>PascalCase</w:t>
+            </w:r>
+            <w:proofErr w:type="spellEnd"/>
+            <w:r>
+              <w:t xml:space="preserve"> + .</w:t>
+            </w:r>
+            <w:proofErr w:type="spellStart"/>
+            <w:r>
+              <w:t>tsx</w:t>
+            </w:r>
+            <w:proofErr w:type="spellEnd"/>
+          </w:p>
+        </w:tc>
+        <w:tc>
+          <w:tcPr>
+            <w:tcW w:w="4232" w:type="dxa"/>
+            <w:tcBorders>
+              <w:bottom w:val="single" w:sz="4" w:space="0" w:color="D3D1C7"/>
+            </w:tcBorders>
+            <w:shd w:val="clear" w:color="auto" w:fill="F1EFE8"/>
+            <w:vAlign w:val="center"/>
+            <w:hideMark/>
+          </w:tcPr>
+          <w:p>
+            <w:pPr>
+              <w:jc w:val="center"/>
+            </w:pPr>
+            <w:proofErr w:type="spellStart"/>
+            <w:r>
+              <w:t>UserCard.tsx</w:t>
+            </w:r>
+            <w:proofErr w:type="spellEnd"/>
+            <w:r>
+              <w:t xml:space="preserve">, </w:t>
+            </w:r>
+            <w:proofErr w:type="spellStart"/>
+            <w:r>
+              <w:t>NavigationMenu.tsx</w:t>
+            </w:r>
+            <w:proofErr w:type="spellEnd"/>
+          </w:p>
+        </w:tc>
+      </w:tr>
+      <w:tr>
+        <w:tc>
+          <w:tcPr>
+            <w:tcW w:w="2127" w:type="dxa"/>
+            <w:tcBorders>
+              <w:bottom w:val="single" w:sz="4" w:space="0" w:color="D3D1C7"/>
+            </w:tcBorders>
+            <w:shd w:val="clear" w:color="auto" w:fill="F1EFE8"/>
+            <w:vAlign w:val="center"/>
+            <w:hideMark/>
+          </w:tcPr>
+          <w:p>
+            <w:pPr>
+              <w:jc w:val="center"/>
+            </w:pPr>
+            <w:proofErr w:type="spellStart"/>
+            <w:r>
+              <w:t>Custom</w:t>
+            </w:r>
+            <w:proofErr w:type="spellEnd"/>
+            <w:r>
+              <w:t xml:space="preserve"> </w:t>
+            </w:r>
+            <w:proofErr w:type="spellStart"/>
+            <w:r>
+              <w:t>hook</w:t>
+            </w:r>
+            <w:proofErr w:type="spellEnd"/>
+          </w:p>
+        </w:tc>
+        <w:tc>
+          <w:tcPr>
+            <w:tcW w:w="3139" w:type="dxa"/>
+            <w:tcBorders>
+              <w:bottom w:val="single" w:sz="4" w:space="0" w:color="D3D1C7"/>
+            </w:tcBorders>
+            <w:shd w:val="clear" w:color="auto" w:fill="F1EFE8"/>
+            <w:vAlign w:val="center"/>
+            <w:hideMark/>
+          </w:tcPr>
+          <w:p>
+            <w:pPr>
+              <w:jc w:val="center"/>
+            </w:pPr>
+            <w:proofErr w:type="spellStart"/>
+            <w:r>
+              <w:t>camelCase</w:t>
+            </w:r>
+            <w:proofErr w:type="spellEnd"/>
+            <w:r>
+              <w:t>, začíná "use" + .</w:t>
+            </w:r>
+            <w:proofErr w:type="spellStart"/>
+            <w:r>
+              <w:t>ts</w:t>
+            </w:r>
+            <w:proofErr w:type="spellEnd"/>
+          </w:p>
+        </w:tc>
+        <w:tc>
+          <w:tcPr>
+            <w:tcW w:w="4232" w:type="dxa"/>
+            <w:tcBorders>
+              <w:bottom w:val="single" w:sz="4" w:space="0" w:color="D3D1C7"/>
+            </w:tcBorders>
+            <w:shd w:val="clear" w:color="auto" w:fill="F1EFE8"/>
+            <w:vAlign w:val="center"/>
+            <w:hideMark/>
+          </w:tcPr>
+          <w:p>
+            <w:pPr>
+              <w:jc w:val="center"/>
+            </w:pPr>
+            <w:proofErr w:type="spellStart"/>
+            <w:r>
+              <w:t>useWindowSize.ts</w:t>
+            </w:r>
+            <w:proofErr w:type="spellEnd"/>
+            <w:r>
+              <w:t xml:space="preserve">, </w:t>
+            </w:r>
+            <w:proofErr w:type="spellStart"/>
+            <w:r>
+              <w:t>useDebounce.ts</w:t>
+            </w:r>
+            <w:proofErr w:type="spellEnd"/>
+          </w:p>
+        </w:tc>
+      </w:tr>
+      <w:tr>
+        <w:tc>
+          <w:tcPr>
+            <w:tcW w:w="2127" w:type="dxa"/>
+            <w:tcBorders>
+              <w:bottom w:val="single" w:sz="4" w:space="0" w:color="D3D1C7"/>
+            </w:tcBorders>
+            <w:shd w:val="clear" w:color="auto" w:fill="F1EFE8"/>
+            <w:vAlign w:val="center"/>
+            <w:hideMark/>
+          </w:tcPr>
+          <w:p>
+            <w:pPr>
+              <w:jc w:val="center"/>
+            </w:pPr>
+            <w:r>
+              <w:t>Utility funkce</w:t>
+            </w:r>
+          </w:p>
+        </w:tc>
+        <w:tc>
+          <w:tcPr>
+            <w:tcW w:w="3139" w:type="dxa"/>
+            <w:tcBorders>
+              <w:bottom w:val="single" w:sz="4" w:space="0" w:color="D3D1C7"/>
+            </w:tcBorders>
+            <w:shd w:val="clear" w:color="auto" w:fill="F1EFE8"/>
+            <w:vAlign w:val="center"/>
+            <w:hideMark/>
+          </w:tcPr>
+          <w:p>
+            <w:pPr>
+              <w:jc w:val="center"/>
+            </w:pPr>
+            <w:proofErr w:type="spellStart"/>
+            <w:r>
+              <w:t>camelCase</w:t>
+            </w:r>
+            <w:proofErr w:type="spellEnd"/>
+            <w:r>
+              <w:t xml:space="preserve"> + .</w:t>
+            </w:r>
+            <w:proofErr w:type="spellStart"/>
+            <w:r>
+              <w:t>ts</w:t>
+            </w:r>
+            <w:proofErr w:type="spellEnd"/>
+          </w:p>
+        </w:tc>
+        <w:tc>
+          <w:tcPr>
+            <w:tcW w:w="4232" w:type="dxa"/>
+            <w:tcBorders>
+              <w:bottom w:val="single" w:sz="4" w:space="0" w:color="D3D1C7"/>
+            </w:tcBorders>
+            <w:shd w:val="clear" w:color="auto" w:fill="F1EFE8"/>
+            <w:vAlign w:val="center"/>
+            <w:hideMark/>
+          </w:tcPr>
+          <w:p>
+            <w:pPr>
+              <w:jc w:val="center"/>
+            </w:pPr>
+            <w:proofErr w:type="spellStart"/>
+            <w:r>
+              <w:t>formatCurrency.ts</w:t>
+            </w:r>
+            <w:proofErr w:type="spellEnd"/>
+            <w:r>
+              <w:t xml:space="preserve">, </w:t>
+            </w:r>
+            <w:proofErr w:type="spellStart"/>
+            <w:r>
+              <w:t>parseDate.ts</w:t>
+            </w:r>
+            <w:proofErr w:type="spellEnd"/>
+          </w:p>
+        </w:tc>
+      </w:tr>
+      <w:tr>
+        <w:tc>
+          <w:tcPr>
+            <w:tcW w:w="2127" w:type="dxa"/>
+            <w:tcBorders>
+              <w:bottom w:val="single" w:sz="4" w:space="0" w:color="D3D1C7"/>
+            </w:tcBorders>
+            <w:shd w:val="clear" w:color="auto" w:fill="F1EFE8"/>
+            <w:vAlign w:val="center"/>
+            <w:hideMark/>
+          </w:tcPr>
+          <w:p>
+            <w:pPr>
+              <w:jc w:val="center"/>
+            </w:pPr>
+            <w:proofErr w:type="spellStart"/>
+            <w:r>
+              <w:t>TypeScript</w:t>
+            </w:r>
+            <w:proofErr w:type="spellEnd"/>
+            <w:r>
+              <w:t xml:space="preserve"> typy</w:t>
+            </w:r>
+          </w:p>
+        </w:tc>
+        <w:tc>
+          <w:tcPr>
+            <w:tcW w:w="3139" w:type="dxa"/>
+            <w:tcBorders>
+              <w:bottom w:val="single" w:sz="4" w:space="0" w:color="D3D1C7"/>
+            </w:tcBorders>
+            <w:shd w:val="clear" w:color="auto" w:fill="F1EFE8"/>
+            <w:vAlign w:val="center"/>
+            <w:hideMark/>
+          </w:tcPr>
+          <w:p>
+            <w:pPr>
+              <w:jc w:val="center"/>
+            </w:pPr>
+            <w:proofErr w:type="spellStart"/>
+            <w:r>
+              <w:t>PascalCase</w:t>
+            </w:r>
+            <w:proofErr w:type="spellEnd"/>
+            <w:r>
+              <w:t xml:space="preserve"> + .</w:t>
+            </w:r>
+            <w:proofErr w:type="spellStart"/>
+            <w:r>
+              <w:t>ts</w:t>
+            </w:r>
+            <w:proofErr w:type="spellEnd"/>
+          </w:p>
+        </w:tc>
+        <w:tc>
+          <w:tcPr>
+            <w:tcW w:w="4232" w:type="dxa"/>
+            <w:tcBorders>
+              <w:bottom w:val="single" w:sz="4" w:space="0" w:color="D3D1C7"/>
+            </w:tcBorders>
+            <w:shd w:val="clear" w:color="auto" w:fill="F1EFE8"/>
+            <w:vAlign w:val="center"/>
+            <w:hideMark/>
+          </w:tcPr>
+          <w:p>
+            <w:pPr>
+              <w:jc w:val="center"/>
+            </w:pPr>
+            <w:proofErr w:type="spellStart"/>
+            <w:r>
+              <w:t>UserProfile.ts</w:t>
+            </w:r>
+            <w:proofErr w:type="spellEnd"/>
+            <w:r>
+              <w:t xml:space="preserve">, </w:t>
+            </w:r>
+            <w:proofErr w:type="spellStart"/>
+            <w:r>
+              <w:t>ApiError.ts</w:t>
+            </w:r>
+            <w:proofErr w:type="spellEnd"/>
+          </w:p>
+        </w:tc>
+      </w:tr>
+      <w:tr>
+        <w:tc>
+          <w:tcPr>
+            <w:tcW w:w="2127" w:type="dxa"/>
+            <w:tcBorders>
+              <w:bottom w:val="single" w:sz="4" w:space="0" w:color="D3D1C7"/>
+            </w:tcBorders>
+            <w:shd w:val="clear" w:color="auto" w:fill="F1EFE8"/>
+            <w:vAlign w:val="center"/>
+            <w:hideMark/>
+          </w:tcPr>
+          <w:p>
+            <w:pPr>
+              <w:jc w:val="center"/>
+            </w:pPr>
+            <w:r>
+              <w:t>Stránka/</w:t>
+            </w:r>
+            <w:proofErr w:type="spellStart"/>
+            <w:r>
+              <w:t>route</w:t>
+            </w:r>
+            <w:proofErr w:type="spellEnd"/>
+          </w:p>
+        </w:tc>
+        <w:tc>
+          <w:tcPr>
+            <w:tcW w:w="3139" w:type="dxa"/>
+            <w:tcBorders>
+              <w:bottom w:val="single" w:sz="4" w:space="0" w:color="D3D1C7"/>
+            </w:tcBorders>
+            <w:shd w:val="clear" w:color="auto" w:fill="F1EFE8"/>
+            <w:vAlign w:val="center"/>
+            <w:hideMark/>
+          </w:tcPr>
+          <w:p>
+            <w:pPr>
+              <w:jc w:val="center"/>
+            </w:pPr>
+            <w:proofErr w:type="spellStart"/>
+            <w:r>
+              <w:t>PascalCase</w:t>
+            </w:r>
+            <w:proofErr w:type="spellEnd"/>
+            <w:r>
+              <w:t xml:space="preserve"> + </w:t>
+            </w:r>
+            <w:proofErr w:type="spellStart"/>
+            <w:r>
+              <w:t>Page.tsx</w:t>
+            </w:r>
+            <w:proofErr w:type="spellEnd"/>
+          </w:p>
+        </w:tc>
+        <w:tc>
+          <w:tcPr>
+            <w:tcW w:w="4232" w:type="dxa"/>
+            <w:tcBorders>
+              <w:bottom w:val="single" w:sz="4" w:space="0" w:color="D3D1C7"/>
+            </w:tcBorders>
+            <w:shd w:val="clear" w:color="auto" w:fill="F1EFE8"/>
+            <w:vAlign w:val="center"/>
+            <w:hideMark/>
+          </w:tcPr>
+          <w:p>
+            <w:pPr>
+              <w:jc w:val="center"/>
+            </w:pPr>
+            <w:proofErr w:type="spellStart"/>
+            <w:r>
+              <w:t>DashboardPage.tsx</w:t>
+            </w:r>
+            <w:proofErr w:type="spellEnd"/>
+            <w:r>
+              <w:t xml:space="preserve">, </w:t>
+            </w:r>
+            <w:proofErr w:type="spellStart"/>
+            <w:r>
+              <w:t>LoginPage.tsx</w:t>
+            </w:r>
+            <w:proofErr w:type="spellEnd"/>
+          </w:p>
+        </w:tc>
+      </w:tr>
+      <w:tr>
+        <w:tc>
+          <w:tcPr>
+            <w:tcW w:w="2127" w:type="dxa"/>
+            <w:tcBorders>
+              <w:bottom w:val="single" w:sz="4" w:space="0" w:color="D3D1C7"/>
+            </w:tcBorders>
+            <w:shd w:val="clear" w:color="auto" w:fill="F1EFE8"/>
+            <w:vAlign w:val="center"/>
+            <w:hideMark/>
+          </w:tcPr>
+          <w:p>
+            <w:pPr>
+              <w:jc w:val="center"/>
+            </w:pPr>
+            <w:r>
+              <w:t>Konstanty</w:t>
+            </w:r>
+          </w:p>
+        </w:tc>
+        <w:tc>
+          <w:tcPr>
+            <w:tcW w:w="3139" w:type="dxa"/>
+            <w:tcBorders>
+              <w:bottom w:val="single" w:sz="4" w:space="0" w:color="D3D1C7"/>
+            </w:tcBorders>
+            <w:shd w:val="clear" w:color="auto" w:fill="F1EFE8"/>
+            <w:vAlign w:val="center"/>
+            <w:hideMark/>
+          </w:tcPr>
+          <w:p>
+            <w:pPr>
+              <w:jc w:val="center"/>
+            </w:pPr>
+            <w:r>
+              <w:t>SCREAMING_SNAKE_CASE</w:t>
+            </w:r>
+          </w:p>
+        </w:tc>
+        <w:tc>
+          <w:tcPr>
+            <w:tcW w:w="4232" w:type="dxa"/>
+            <w:tcBorders>
+              <w:bottom w:val="single" w:sz="4" w:space="0" w:color="D3D1C7"/>
+            </w:tcBorders>
+            <w:shd w:val="clear" w:color="auto" w:fill="F1EFE8"/>
+            <w:vAlign w:val="center"/>
+            <w:hideMark/>
+          </w:tcPr>
+          <w:p>
+            <w:pPr>
+              <w:jc w:val="center"/>
+            </w:pPr>
+            <w:r>
+              <w:t>API_BASE_URL, MAX_RETRIES</w:t>
+            </w:r>
+          </w:p>
+        </w:tc>
+      </w:tr>
+      <w:tr>
+        <w:tc>
+          <w:tcPr>
+            <w:tcW w:w="2127" w:type="dxa"/>
+            <w:tcBorders>
+              <w:bottom w:val="nil"/>
+            </w:tcBorders>
+            <w:shd w:val="clear" w:color="auto" w:fill="F1EFE8"/>
+            <w:vAlign w:val="center"/>
+            <w:hideMark/>
+          </w:tcPr>
+          <w:p>
+            <w:pPr>
+              <w:jc w:val="center"/>
+            </w:pPr>
+            <w:r>
+              <w:t>CSS třídy</w:t>
+            </w:r>
+          </w:p>
+        </w:tc>
+        <w:tc>
+          <w:tcPr>
+            <w:tcW w:w="3139" w:type="dxa"/>
+            <w:tcBorders>
+              <w:bottom w:val="nil"/>
+            </w:tcBorders>
+            <w:shd w:val="clear" w:color="auto" w:fill="F1EFE8"/>
+            <w:vAlign w:val="center"/>
+            <w:hideMark/>
+          </w:tcPr>
+          <w:p>
+            <w:pPr>
+              <w:jc w:val="center"/>
+            </w:pPr>
+            <w:r>
+              <w:t>kebab-case</w:t>
+            </w:r>
+          </w:p>
+        </w:tc>
+        <w:tc>
+          <w:tcPr>
+            <w:tcW w:w="4232" w:type="dxa"/>
+            <w:tcBorders>
+              <w:bottom w:val="nil"/>
+            </w:tcBorders>
+            <w:shd w:val="clear" w:color="auto" w:fill="F1EFE8"/>
+            <w:vAlign w:val="center"/>
+            <w:hideMark/>
+          </w:tcPr>
+          <w:p>
+            <w:pPr>
+              <w:jc w:val="center"/>
+            </w:pPr>
+            <w:r>
+              <w:t>.user-</w:t>
+            </w:r>
+            <w:proofErr w:type="spellStart"/>
+            <w:r>
+              <w:t>card</w:t>
+            </w:r>
+            <w:proofErr w:type="spellEnd"/>
+            <w:r>
+              <w:t>, .nav-menu</w:t>
+            </w:r>
+          </w:p>
+        </w:tc>
+      </w:tr>
+    </w:tbl>
+    <w:p>
+      <w:pPr>
+        <w:pStyle w:val="Nadpis2"/>
+      </w:pPr>
+      <w:r>
+        <w:t xml:space="preserve">Pravidla pro </w:t>
+      </w:r>
+      <w:proofErr w:type="spellStart"/>
+      <w:r>
+        <w:t>react</w:t>
+      </w:r>
+      <w:proofErr w:type="spellEnd"/>
+      <w:r>
+        <w:t xml:space="preserve"> komponenty</w:t>
+      </w:r>
+    </w:p>
+    <w:p>
+      <w:r>
+        <w:t>Každá komponenta by měla mít jednu funkci, jednu zodpovědnost. Je lepší mít více malých souborů než jeden velký</w:t>
+      </w:r>
+    </w:p>
+    <w:tbl>
+      <w:tblPr>
+        <w:tblW w:w="10206" w:type="dxa"/>
+        <w:shd w:val="clear" w:color="auto" w:fill="F1EFE8"/>
+        <w:tblCellMar>
+          <w:left w:w="0" w:type="dxa"/>
+          <w:right w:w="0" w:type="dxa"/>
+        </w:tblCellMar>
+        <w:tblLook w:val="04A0" w:firstRow="1" w:lastRow="0" w:firstColumn="1" w:lastColumn="0" w:noHBand="0" w:noVBand="1"/>
+      </w:tblPr>
+      <w:tblGrid>
+        <w:gridCol w:w="1535"/>
+        <w:gridCol w:w="3567"/>
+        <w:gridCol w:w="5104"/>
+      </w:tblGrid>
+      <w:tr>
+        <w:tc>
+          <w:tcPr>
+            <w:tcW w:w="1535" w:type="dxa"/>
+            <w:tcBorders>
+              <w:bottom w:val="single" w:sz="4" w:space="0" w:color="D3D1C7"/>
+            </w:tcBorders>
+            <w:shd w:val="clear" w:color="auto" w:fill="F1EFE8"/>
+            <w:vAlign w:val="center"/>
+            <w:hideMark/>
+          </w:tcPr>
+          <w:p>
+            <w:pPr>
+              <w:jc w:val="center"/>
+            </w:pPr>
+            <w:r>
+              <w:rPr>
+                <w:b/>
+                <w:bCs/>
+              </w:rPr>
+              <w:t>Jedna zodpovědnost</w:t>
+            </w:r>
+          </w:p>
+        </w:tc>
+        <w:tc>
+          <w:tcPr>
+            <w:tcW w:w="0" w:type="auto"/>
+            <w:tcBorders>
+              <w:bottom w:val="single" w:sz="4" w:space="0" w:color="D3D1C7"/>
+            </w:tcBorders>
+            <w:shd w:val="clear" w:color="auto" w:fill="F1EFE8"/>
+            <w:vAlign w:val="center"/>
+            <w:hideMark/>
+          </w:tcPr>
+          <w:p>
+            <w:pPr>
+              <w:jc w:val="center"/>
+            </w:pPr>
+            <w:proofErr w:type="spellStart"/>
+            <w:r>
+              <w:t>UserCardWithFormAndModal.tsx</w:t>
+            </w:r>
+            <w:proofErr w:type="spellEnd"/>
+          </w:p>
+        </w:tc>
+        <w:tc>
+          <w:tcPr>
+            <w:tcW w:w="5104" w:type="dxa"/>
+            <w:tcBorders>
+              <w:bottom w:val="single" w:sz="4" w:space="0" w:color="D3D1C7"/>
+            </w:tcBorders>
+            <w:shd w:val="clear" w:color="auto" w:fill="F1EFE8"/>
+            <w:vAlign w:val="center"/>
+            <w:hideMark/>
+          </w:tcPr>
+          <w:p>
+            <w:pPr>
+              <w:jc w:val="center"/>
+            </w:pPr>
+            <w:proofErr w:type="spellStart"/>
+            <w:r>
+              <w:t>UserCard.tsx</w:t>
+            </w:r>
+            <w:proofErr w:type="spellEnd"/>
+            <w:r>
+              <w:t xml:space="preserve"> + </w:t>
+            </w:r>
+            <w:proofErr w:type="spellStart"/>
+            <w:r>
+              <w:t>EditUserModal.tsx</w:t>
+            </w:r>
+            <w:proofErr w:type="spellEnd"/>
+          </w:p>
+        </w:tc>
+      </w:tr>
+      <w:tr>
+        <w:tc>
+          <w:tcPr>
+            <w:tcW w:w="1535" w:type="dxa"/>
+            <w:tcBorders>
+              <w:bottom w:val="single" w:sz="4" w:space="0" w:color="D3D1C7"/>
+            </w:tcBorders>
+            <w:shd w:val="clear" w:color="auto" w:fill="F1EFE8"/>
+            <w:vAlign w:val="center"/>
+            <w:hideMark/>
+          </w:tcPr>
+          <w:p>
+            <w:pPr>
+              <w:jc w:val="center"/>
+            </w:pPr>
+            <w:r>
+              <w:rPr>
+                <w:b/>
+                <w:bCs/>
+              </w:rPr>
+              <w:t xml:space="preserve">Explicitní </w:t>
+            </w:r>
+            <w:proofErr w:type="spellStart"/>
+            <w:r>
+              <w:rPr>
+                <w:b/>
+                <w:bCs/>
+              </w:rPr>
+              <w:t>props</w:t>
+            </w:r>
+            <w:proofErr w:type="spellEnd"/>
+            <w:r>
+              <w:rPr>
+                <w:b/>
+                <w:bCs/>
+              </w:rPr>
+              <w:t xml:space="preserve"> typy</w:t>
+            </w:r>
+          </w:p>
+        </w:tc>
+        <w:tc>
+          <w:tcPr>
+            <w:tcW w:w="0" w:type="auto"/>
+            <w:tcBorders>
+              <w:bottom w:val="single" w:sz="4" w:space="0" w:color="D3D1C7"/>
+            </w:tcBorders>
+            <w:shd w:val="clear" w:color="auto" w:fill="F1EFE8"/>
+            <w:vAlign w:val="center"/>
+            <w:hideMark/>
+          </w:tcPr>
+          <w:p>
+            <w:pPr>
+              <w:jc w:val="center"/>
+            </w:pPr>
+            <w:proofErr w:type="spellStart"/>
+            <w:r>
+              <w:t>function</w:t>
+            </w:r>
+            <w:proofErr w:type="spellEnd"/>
+            <w:r>
+              <w:t xml:space="preserve"> </w:t>
+            </w:r>
+            <w:proofErr w:type="spellStart"/>
+            <w:r>
+              <w:t>Button</w:t>
+            </w:r>
+            <w:proofErr w:type="spellEnd"/>
+            <w:r>
+              <w:t>(</w:t>
+            </w:r>
+            <w:proofErr w:type="spellStart"/>
+            <w:r>
+              <w:t>props</w:t>
+            </w:r>
+            <w:proofErr w:type="spellEnd"/>
+            <w:r>
+              <w:t>: any)</w:t>
+            </w:r>
+          </w:p>
+        </w:tc>
+        <w:tc>
+          <w:tcPr>
+            <w:tcW w:w="5104" w:type="dxa"/>
+            <w:tcBorders>
+              <w:bottom w:val="single" w:sz="4" w:space="0" w:color="D3D1C7"/>
+            </w:tcBorders>
+            <w:shd w:val="clear" w:color="auto" w:fill="F1EFE8"/>
+            <w:vAlign w:val="center"/>
+            <w:hideMark/>
+          </w:tcPr>
+          <w:p>
+            <w:pPr>
+              <w:jc w:val="center"/>
+            </w:pPr>
+            <w:proofErr w:type="spellStart"/>
+            <w:r>
+              <w:t>function</w:t>
+            </w:r>
+            <w:proofErr w:type="spellEnd"/>
+            <w:r>
+              <w:t xml:space="preserve"> </w:t>
+            </w:r>
+            <w:proofErr w:type="spellStart"/>
+            <w:r>
+              <w:t>Button</w:t>
+            </w:r>
+            <w:proofErr w:type="spellEnd"/>
+            <w:r>
+              <w:t xml:space="preserve">({ label, </w:t>
+            </w:r>
+            <w:proofErr w:type="spellStart"/>
+            <w:r>
+              <w:t>onClick</w:t>
+            </w:r>
+            <w:proofErr w:type="spellEnd"/>
+            <w:r>
+              <w:t xml:space="preserve"> }: </w:t>
+            </w:r>
+            <w:proofErr w:type="spellStart"/>
+            <w:r>
+              <w:t>ButtonProps</w:t>
+            </w:r>
+            <w:proofErr w:type="spellEnd"/>
+            <w:r>
+              <w:t>)</w:t>
+            </w:r>
+          </w:p>
+        </w:tc>
+      </w:tr>
+      <w:tr>
+        <w:tc>
+          <w:tcPr>
+            <w:tcW w:w="1535" w:type="dxa"/>
+            <w:tcBorders>
+              <w:bottom w:val="single" w:sz="4" w:space="0" w:color="D3D1C7"/>
+            </w:tcBorders>
+            <w:shd w:val="clear" w:color="auto" w:fill="F1EFE8"/>
+            <w:vAlign w:val="center"/>
+            <w:hideMark/>
+          </w:tcPr>
+          <w:p>
+            <w:pPr>
+              <w:jc w:val="center"/>
+            </w:pPr>
+            <w:r>
+              <w:rPr>
+                <w:b/>
+                <w:bCs/>
+              </w:rPr>
+              <w:t xml:space="preserve">Vyhněte se </w:t>
+            </w:r>
+            <w:proofErr w:type="spellStart"/>
+            <w:r>
+              <w:rPr>
+                <w:b/>
+                <w:bCs/>
+              </w:rPr>
+              <w:t>prop</w:t>
+            </w:r>
+            <w:proofErr w:type="spellEnd"/>
+            <w:r>
+              <w:rPr>
+                <w:b/>
+                <w:bCs/>
+              </w:rPr>
+              <w:t xml:space="preserve"> </w:t>
+            </w:r>
+            <w:proofErr w:type="spellStart"/>
+            <w:r>
+              <w:rPr>
+                <w:b/>
+                <w:bCs/>
+              </w:rPr>
+              <w:t>drillingu</w:t>
+            </w:r>
+            <w:proofErr w:type="spellEnd"/>
+          </w:p>
+        </w:tc>
+        <w:tc>
+          <w:tcPr>
+            <w:tcW w:w="0" w:type="auto"/>
+            <w:tcBorders>
+              <w:bottom w:val="single" w:sz="4" w:space="0" w:color="D3D1C7"/>
+            </w:tcBorders>
+            <w:shd w:val="clear" w:color="auto" w:fill="F1EFE8"/>
+            <w:vAlign w:val="center"/>
+            <w:hideMark/>
+          </w:tcPr>
+          <w:p>
+            <w:pPr>
+              <w:jc w:val="center"/>
+            </w:pPr>
+            <w:r>
+              <w:t>Předávání přes 3+ úrovně</w:t>
+            </w:r>
+          </w:p>
+        </w:tc>
+        <w:tc>
+          <w:tcPr>
+            <w:tcW w:w="5104" w:type="dxa"/>
+            <w:tcBorders>
+              <w:bottom w:val="single" w:sz="4" w:space="0" w:color="D3D1C7"/>
+            </w:tcBorders>
+            <w:shd w:val="clear" w:color="auto" w:fill="F1EFE8"/>
+            <w:vAlign w:val="center"/>
+            <w:hideMark/>
+          </w:tcPr>
+          <w:p>
+            <w:pPr>
+              <w:jc w:val="center"/>
+            </w:pPr>
+            <w:proofErr w:type="spellStart"/>
+            <w:r>
+              <w:t>Context</w:t>
+            </w:r>
+            <w:proofErr w:type="spellEnd"/>
+            <w:r>
+              <w:t xml:space="preserve"> API nebo </w:t>
+            </w:r>
+            <w:proofErr w:type="spellStart"/>
+            <w:r>
+              <w:t>Zustand</w:t>
+            </w:r>
+            <w:proofErr w:type="spellEnd"/>
+          </w:p>
+        </w:tc>
+      </w:tr>
+      <w:tr>
+        <w:tc>
+          <w:tcPr>
+            <w:tcW w:w="1535" w:type="dxa"/>
+            <w:tcBorders>
+              <w:bottom w:val="single" w:sz="4" w:space="0" w:color="D3D1C7"/>
+            </w:tcBorders>
+            <w:shd w:val="clear" w:color="auto" w:fill="F1EFE8"/>
+            <w:vAlign w:val="center"/>
+            <w:hideMark/>
+          </w:tcPr>
+          <w:p>
+            <w:pPr>
+              <w:jc w:val="center"/>
+            </w:pPr>
+            <w:r>
+              <w:rPr>
+                <w:b/>
+                <w:bCs/>
+              </w:rPr>
+              <w:t>Komponenty malé a čitelné</w:t>
+            </w:r>
+          </w:p>
+        </w:tc>
+        <w:tc>
+          <w:tcPr>
+            <w:tcW w:w="0" w:type="auto"/>
+            <w:tcBorders>
+              <w:bottom w:val="single" w:sz="4" w:space="0" w:color="D3D1C7"/>
+            </w:tcBorders>
+            <w:shd w:val="clear" w:color="auto" w:fill="F1EFE8"/>
+            <w:vAlign w:val="center"/>
+            <w:hideMark/>
+          </w:tcPr>
+          <w:p>
+            <w:pPr>
+              <w:jc w:val="center"/>
+            </w:pPr>
+            <w:r>
+              <w:t>500+ řádků v komponentě</w:t>
+            </w:r>
+          </w:p>
+        </w:tc>
+        <w:tc>
+          <w:tcPr>
+            <w:tcW w:w="5104" w:type="dxa"/>
+            <w:tcBorders>
+              <w:bottom w:val="single" w:sz="4" w:space="0" w:color="D3D1C7"/>
+            </w:tcBorders>
+            <w:shd w:val="clear" w:color="auto" w:fill="F1EFE8"/>
+            <w:vAlign w:val="center"/>
+            <w:hideMark/>
+          </w:tcPr>
+          <w:p>
+            <w:pPr>
+              <w:jc w:val="center"/>
+            </w:pPr>
+            <w:r>
+              <w:t>Max ~150 řádků, pak extrahujte</w:t>
+            </w:r>
+          </w:p>
+        </w:tc>
+      </w:tr>
+      <w:tr>
+        <w:tc>
+          <w:tcPr>
+            <w:tcW w:w="1535" w:type="dxa"/>
+            <w:tcBorders>
+              <w:bottom w:val="nil"/>
+            </w:tcBorders>
+            <w:shd w:val="clear" w:color="auto" w:fill="F1EFE8"/>
+            <w:vAlign w:val="center"/>
+            <w:hideMark/>
+          </w:tcPr>
+          <w:p>
+            <w:pPr>
+              <w:jc w:val="center"/>
+            </w:pPr>
+            <w:proofErr w:type="spellStart"/>
+            <w:r>
+              <w:rPr>
+                <w:b/>
+                <w:bCs/>
+              </w:rPr>
+              <w:t>Hooky</w:t>
+            </w:r>
+            <w:proofErr w:type="spellEnd"/>
+            <w:r>
+              <w:rPr>
+                <w:b/>
+                <w:bCs/>
+              </w:rPr>
+              <w:t xml:space="preserve"> pro logiku</w:t>
+            </w:r>
+          </w:p>
+        </w:tc>
+        <w:tc>
+          <w:tcPr>
+            <w:tcW w:w="0" w:type="auto"/>
+            <w:tcBorders>
+              <w:bottom w:val="nil"/>
+            </w:tcBorders>
+            <w:shd w:val="clear" w:color="auto" w:fill="F1EFE8"/>
+            <w:vAlign w:val="center"/>
+            <w:hideMark/>
+          </w:tcPr>
+          <w:p>
+            <w:pPr>
+              <w:jc w:val="center"/>
+            </w:pPr>
+            <w:r>
+              <w:t>Logika přímo v JSX</w:t>
+            </w:r>
+          </w:p>
+        </w:tc>
+        <w:tc>
+          <w:tcPr>
+            <w:tcW w:w="5104" w:type="dxa"/>
+            <w:tcBorders>
+              <w:bottom w:val="nil"/>
+            </w:tcBorders>
+            <w:shd w:val="clear" w:color="auto" w:fill="F1EFE8"/>
+            <w:vAlign w:val="center"/>
+            <w:hideMark/>
+          </w:tcPr>
+          <w:p>
+            <w:pPr>
+              <w:jc w:val="center"/>
+            </w:pPr>
+            <w:r>
+              <w:t xml:space="preserve">Přesunout do </w:t>
+            </w:r>
+            <w:proofErr w:type="spellStart"/>
+            <w:r>
+              <w:t>custom</w:t>
+            </w:r>
+            <w:proofErr w:type="spellEnd"/>
+            <w:r>
+              <w:t xml:space="preserve"> </w:t>
+            </w:r>
+            <w:proofErr w:type="spellStart"/>
+            <w:r>
+              <w:t>hooku</w:t>
+            </w:r>
+            <w:proofErr w:type="spellEnd"/>
+          </w:p>
+        </w:tc>
+      </w:tr>
+    </w:tbl>
+    <w:p>
+      <w:pPr>
+        <w:pStyle w:val="Nadpis1"/>
+      </w:pPr>
+      <w:proofErr w:type="spellStart"/>
+      <w:r>
+        <w:lastRenderedPageBreak/>
+        <w:t>Rendering</w:t>
+      </w:r>
+      <w:proofErr w:type="spellEnd"/>
+    </w:p>
+    <w:p>
+      <w:pPr>
+        <w:pStyle w:val="Nadpis2"/>
+      </w:pPr>
+      <w:r>
+        <w:t>CSR</w:t>
+      </w:r>
+    </w:p>
+    <w:p>
+      <w:r>
+        <w:drawing>
+          <wp:inline distT="0" distB="0" distL="0" distR="0" wp14:anchorId="162CC483" wp14:editId="270371DC">
+            <wp:extent cx="5760720" cy="2283460"/>
+            <wp:effectExtent l="0" t="0" r="0" b="2540"/>
+            <wp:docPr id="633830626" name="Obrázek 1"/>
+            <wp:cNvGraphicFramePr>
+              <a:graphicFrameLocks xmlns:a="http://schemas.openxmlformats.org/drawingml/2006/main" noChangeAspect="1"/>
+            </wp:cNvGraphicFramePr>
+            <a:graphic xmlns:a="http://schemas.openxmlformats.org/drawingml/2006/main">
+              <a:graphicData uri="http://schemas.openxmlformats.org/drawingml/2006/picture">
+                <pic:pic xmlns:pic="http://schemas.openxmlformats.org/drawingml/2006/picture">
+                  <pic:nvPicPr>
+                    <pic:cNvPr id="633830626" name=""/>
+                    <pic:cNvPicPr/>
+                  </pic:nvPicPr>
+                  <pic:blipFill>
+                    <a:blip r:embed="rId13"/>
+                    <a:stretch>
+                      <a:fillRect/>
+                    </a:stretch>
+                  </pic:blipFill>
+                  <pic:spPr>
+                    <a:xfrm>
+                      <a:off x="0" y="0"/>
+                      <a:ext cx="5760720" cy="2283460"/>
+                    </a:xfrm>
+                    <a:prstGeom prst="rect">
+                      <a:avLst/>
+                    </a:prstGeom>
+                  </pic:spPr>
+                </pic:pic>
+              </a:graphicData>
+            </a:graphic>
+          </wp:inline>
+        </w:drawing>
+      </w:r>
+    </w:p>
+    <w:p>
+      <w:pPr>
+        <w:pStyle w:val="Nadpis2"/>
+      </w:pPr>
+      <w:r>
+        <w:t>SSR</w:t>
+      </w:r>
+    </w:p>
+    <w:p>
+      <w:r>
+        <w:drawing>
+          <wp:inline distT="0" distB="0" distL="0" distR="0" wp14:anchorId="1987A005" wp14:editId="4B4BFC68">
+            <wp:extent cx="5760720" cy="2299970"/>
+            <wp:effectExtent l="0" t="0" r="0" b="5080"/>
+            <wp:docPr id="628947629" name="Obrázek 1"/>
+            <wp:cNvGraphicFramePr>
+              <a:graphicFrameLocks xmlns:a="http://schemas.openxmlformats.org/drawingml/2006/main" noChangeAspect="1"/>
+            </wp:cNvGraphicFramePr>
+            <a:graphic xmlns:a="http://schemas.openxmlformats.org/drawingml/2006/main">
+              <a:graphicData uri="http://schemas.openxmlformats.org/drawingml/2006/picture">
+                <pic:pic xmlns:pic="http://schemas.openxmlformats.org/drawingml/2006/picture">
+                  <pic:nvPicPr>
+                    <pic:cNvPr id="628947629" name=""/>
+                    <pic:cNvPicPr/>
+                  </pic:nvPicPr>
+                  <pic:blipFill>
+                    <a:blip r:embed="rId14"/>
+                    <a:stretch>
+                      <a:fillRect/>
+                    </a:stretch>
+                  </pic:blipFill>
+                  <pic:spPr>
+                    <a:xfrm>
+                      <a:off x="0" y="0"/>
+                      <a:ext cx="5760720" cy="2299970"/>
+                    </a:xfrm>
+                    <a:prstGeom prst="rect">
+                      <a:avLst/>
+                    </a:prstGeom>
+                  </pic:spPr>
+                </pic:pic>
+              </a:graphicData>
+            </a:graphic>
+          </wp:inline>
+        </w:drawing>
+      </w:r>
+    </w:p>
+    <w:p>
+      <w:pPr>
+        <w:pStyle w:val="Nadpis2"/>
+      </w:pPr>
+      <w:r>
+        <w:t>SSG</w:t>
+      </w:r>
+    </w:p>
+    <w:p>
+      <w:r>
+        <w:drawing>
+          <wp:inline distT="0" distB="0" distL="0" distR="0" wp14:anchorId="1FC526CB" wp14:editId="1D96AB55">
+            <wp:extent cx="5760720" cy="2256790"/>
+            <wp:effectExtent l="0" t="0" r="0" b="0"/>
+            <wp:docPr id="1586612395" name="Obrázek 1"/>
+            <wp:cNvGraphicFramePr>
+              <a:graphicFrameLocks xmlns:a="http://schemas.openxmlformats.org/drawingml/2006/main" noChangeAspect="1"/>
+            </wp:cNvGraphicFramePr>
+            <a:graphic xmlns:a="http://schemas.openxmlformats.org/drawingml/2006/main">
+              <a:graphicData uri="http://schemas.openxmlformats.org/drawingml/2006/picture">
+                <pic:pic xmlns:pic="http://schemas.openxmlformats.org/drawingml/2006/picture">
+                  <pic:nvPicPr>
+                    <pic:cNvPr id="1586612395" name=""/>
+                    <pic:cNvPicPr/>
+                  </pic:nvPicPr>
+                  <pic:blipFill>
+                    <a:blip r:embed="rId15"/>
+                    <a:stretch>
+                      <a:fillRect/>
+                    </a:stretch>
+                  </pic:blipFill>
+                  <pic:spPr>
+                    <a:xfrm>
+                      <a:off x="0" y="0"/>
+                      <a:ext cx="5760720" cy="2256790"/>
+                    </a:xfrm>
+                    <a:prstGeom prst="rect">
+                      <a:avLst/>
+                    </a:prstGeom>
+                  </pic:spPr>
+                </pic:pic>
+              </a:graphicData>
+            </a:graphic>
+          </wp:inline>
+        </w:drawing>
+      </w:r>
+    </w:p>
+    <w:p>
+      <w:pPr>
+        <w:pStyle w:val="Nadpis2"/>
+      </w:pPr>
+      <w:r>
+        <w:lastRenderedPageBreak/>
+        <w:t xml:space="preserve">Srovnání CSR vs. SSR vs. </w:t>
+      </w:r>
+    </w:p>
+    <w:p>
+      <w:r>
+        <w:drawing>
+          <wp:inline distT="0" distB="0" distL="0" distR="0" wp14:anchorId="482B096C" wp14:editId="26E25D80">
+            <wp:extent cx="5760720" cy="2163445"/>
+            <wp:effectExtent l="0" t="0" r="0" b="8255"/>
+            <wp:docPr id="255784454" name="Obrázek 1"/>
+            <wp:cNvGraphicFramePr>
+              <a:graphicFrameLocks xmlns:a="http://schemas.openxmlformats.org/drawingml/2006/main" noChangeAspect="1"/>
+            </wp:cNvGraphicFramePr>
+            <a:graphic xmlns:a="http://schemas.openxmlformats.org/drawingml/2006/main">
+              <a:graphicData uri="http://schemas.openxmlformats.org/drawingml/2006/picture">
+                <pic:pic xmlns:pic="http://schemas.openxmlformats.org/drawingml/2006/picture">
+                  <pic:nvPicPr>
+                    <pic:cNvPr id="255784454" name=""/>
+                    <pic:cNvPicPr/>
+                  </pic:nvPicPr>
+                  <pic:blipFill>
+                    <a:blip r:embed="rId16"/>
+                    <a:stretch>
+                      <a:fillRect/>
+                    </a:stretch>
+                  </pic:blipFill>
+                  <pic:spPr>
+                    <a:xfrm>
+                      <a:off x="0" y="0"/>
+                      <a:ext cx="5760720" cy="2163445"/>
+                    </a:xfrm>
+                    <a:prstGeom prst="rect">
+                      <a:avLst/>
+                    </a:prstGeom>
+                  </pic:spPr>
+                </pic:pic>
+              </a:graphicData>
+            </a:graphic>
+          </wp:inline>
+        </w:drawing>
+      </w:r>
+    </w:p>
+    <w:p>
+      <w:pPr>
+        <w:pStyle w:val="Nadpis1"/>
+      </w:pPr>
+      <w:r>
+        <w:t>Komponenty</w:t>
+      </w:r>
+    </w:p>
+    <w:p>
+      <w:r>
+        <w:t xml:space="preserve">Komponenta je samostatná část uživatelského rozhraní. Může to být tlačítko, karta filmu, formulář, navigace nebo celá stránka. V </w:t>
+      </w:r>
+      <w:proofErr w:type="spellStart"/>
+      <w:r>
+        <w:t>Reactu</w:t>
+      </w:r>
+      <w:proofErr w:type="spellEnd"/>
+      <w:r>
+        <w:t xml:space="preserve"> komponentu většinou píšeme jako funkci, která vrací JSX. JSX je zápis podobný HTML, ale ve skutečnosti je to JavaScript. Díky JSX můžeme jednoduše popsat, co se má zobrazit na stránce, a zároveň v tom používat proměnné, podmínky nebo funkce.</w:t>
+      </w:r>
+    </w:p>
+    <w:p>
+      <w:r>
+        <w:drawing>
+          <wp:inline distT="0" distB="0" distL="0" distR="0" wp14:anchorId="2D63B175" wp14:editId="7BFF4A3B">
+            <wp:extent cx="5760720" cy="1711960"/>
+            <wp:effectExtent l="0" t="0" r="0" b="2540"/>
+            <wp:docPr id="41578823" name="Obrázek 1"/>
+            <wp:cNvGraphicFramePr>
+              <a:graphicFrameLocks xmlns:a="http://schemas.openxmlformats.org/drawingml/2006/main" noChangeAspect="1"/>
+            </wp:cNvGraphicFramePr>
+            <a:graphic xmlns:a="http://schemas.openxmlformats.org/drawingml/2006/main">
+              <a:graphicData uri="http://schemas.openxmlformats.org/drawingml/2006/picture">
+                <pic:pic xmlns:pic="http://schemas.openxmlformats.org/drawingml/2006/picture">
+                  <pic:nvPicPr>
+                    <pic:cNvPr id="41578823" name=""/>
+                    <pic:cNvPicPr/>
+                  </pic:nvPicPr>
+                  <pic:blipFill>
+                    <a:blip r:embed="rId17"/>
+                    <a:stretch>
+                      <a:fillRect/>
+                    </a:stretch>
+                  </pic:blipFill>
+                  <pic:spPr>
+                    <a:xfrm>
+                      <a:off x="0" y="0"/>
+                      <a:ext cx="5760720" cy="1711960"/>
+                    </a:xfrm>
+                    <a:prstGeom prst="rect">
+                      <a:avLst/>
+                    </a:prstGeom>
+                  </pic:spPr>
+                </pic:pic>
+              </a:graphicData>
+            </a:graphic>
+          </wp:inline>
+        </w:drawing>
+      </w:r>
+    </w:p>
+    <w:p>
+      <w:pPr>
+        <w:pStyle w:val="Nadpis2"/>
+      </w:pPr>
+      <w:proofErr w:type="spellStart"/>
+      <w:r>
+        <w:t>Props</w:t>
+      </w:r>
+      <w:proofErr w:type="spellEnd"/>
+      <w:r>
+        <w:t xml:space="preserve"> komponenty</w:t>
+      </w:r>
+    </w:p>
+    <w:p>
+      <w:proofErr w:type="spellStart"/>
+      <w:r>
+        <w:t>Props</w:t>
+      </w:r>
+      <w:proofErr w:type="spellEnd"/>
+      <w:r>
+        <w:t xml:space="preserve"> jsou hodnoty, které předáváme komponentě zvenku. Fungují podobně jako parametry funkce. Rodičovská komponenta pošle data dítěti a dítě je použije pro vykreslení. </w:t>
+      </w:r>
+      <w:proofErr w:type="spellStart"/>
+      <w:r>
+        <w:t>Props</w:t>
+      </w:r>
+      <w:proofErr w:type="spellEnd"/>
+      <w:r>
+        <w:t xml:space="preserve"> jsou </w:t>
+      </w:r>
+      <w:proofErr w:type="spellStart"/>
+      <w:r>
+        <w:t>read</w:t>
+      </w:r>
+      <w:proofErr w:type="spellEnd"/>
+      <w:r>
+        <w:t xml:space="preserve">-only, což znamená, že je komponenta nemá uvnitř měnit. Pokud chceme změnit data v aplikaci, řešíme to přes stav nebo přes funkci, kterou komponentě předáme také jako </w:t>
+      </w:r>
+      <w:proofErr w:type="spellStart"/>
+      <w:r>
+        <w:t>prop</w:t>
+      </w:r>
+      <w:proofErr w:type="spellEnd"/>
+      <w:r>
+        <w:t>.</w:t>
+      </w:r>
+    </w:p>
+    <w:p>
+      <w:r>
+        <w:lastRenderedPageBreak/>
+        <w:drawing>
+          <wp:inline distT="0" distB="0" distL="0" distR="0" wp14:anchorId="45AD1523" wp14:editId="35E69BA0">
+            <wp:extent cx="5760720" cy="3546475"/>
+            <wp:effectExtent l="0" t="0" r="0" b="0"/>
+            <wp:docPr id="242512526" name="Obrázek 1"/>
+            <wp:cNvGraphicFramePr>
+              <a:graphicFrameLocks xmlns:a="http://schemas.openxmlformats.org/drawingml/2006/main" noChangeAspect="1"/>
+            </wp:cNvGraphicFramePr>
+            <a:graphic xmlns:a="http://schemas.openxmlformats.org/drawingml/2006/main">
+              <a:graphicData uri="http://schemas.openxmlformats.org/drawingml/2006/picture">
+                <pic:pic xmlns:pic="http://schemas.openxmlformats.org/drawingml/2006/picture">
+                  <pic:nvPicPr>
+                    <pic:cNvPr id="242512526" name=""/>
+                    <pic:cNvPicPr/>
+                  </pic:nvPicPr>
+                  <pic:blipFill>
+                    <a:blip r:embed="rId18"/>
+                    <a:stretch>
+                      <a:fillRect/>
+                    </a:stretch>
+                  </pic:blipFill>
+                  <pic:spPr>
+                    <a:xfrm>
+                      <a:off x="0" y="0"/>
+                      <a:ext cx="5760720" cy="3546475"/>
+                    </a:xfrm>
+                    <a:prstGeom prst="rect">
+                      <a:avLst/>
+                    </a:prstGeom>
+                  </pic:spPr>
+                </pic:pic>
+              </a:graphicData>
+            </a:graphic>
+          </wp:inline>
+        </w:drawing>
+      </w:r>
+    </w:p>
+    <w:p>
+      <w:pPr>
+        <w:pStyle w:val="Nadpis2"/>
+      </w:pPr>
+      <w:proofErr w:type="spellStart"/>
+      <w:r>
+        <w:t>Composition</w:t>
+      </w:r>
+      <w:proofErr w:type="spellEnd"/>
+      <w:r>
+        <w:t xml:space="preserve"> </w:t>
+      </w:r>
+      <w:proofErr w:type="spellStart"/>
+      <w:r>
+        <w:t>pattern</w:t>
+      </w:r>
+      <w:proofErr w:type="spellEnd"/>
+    </w:p>
+    <w:p>
+      <w:proofErr w:type="spellStart"/>
+      <w:r>
+        <w:t>Composition</w:t>
+      </w:r>
+      <w:proofErr w:type="spellEnd"/>
+      <w:r>
+        <w:t xml:space="preserve"> znamená skládání většího celku z menších částí. V </w:t>
+      </w:r>
+      <w:proofErr w:type="spellStart"/>
+      <w:r>
+        <w:t>Reactu</w:t>
+      </w:r>
+      <w:proofErr w:type="spellEnd"/>
+      <w:r>
+        <w:t xml:space="preserve"> se místo jedné obří komponenty snažíme vytvářet více menších komponent, z nichž každá má jasný úkol. Například stránka uživatele se může skládat z hlavičky, statistik a seznamu aktivit. Díky tomu je kód přehlednější, lépe se upravuje a jednotlivé komponenty můžeme použít znovu na více místech.</w:t>
+      </w:r>
+    </w:p>
+    <w:p>
+      <w:r>
+        <w:drawing>
+          <wp:inline distT="0" distB="0" distL="0" distR="0" wp14:anchorId="040D6C4B" wp14:editId="7B81512E">
+            <wp:extent cx="5760720" cy="3531235"/>
+            <wp:effectExtent l="0" t="0" r="0" b="0"/>
+            <wp:docPr id="393098949" name="Obrázek 1"/>
+            <wp:cNvGraphicFramePr>
+              <a:graphicFrameLocks xmlns:a="http://schemas.openxmlformats.org/drawingml/2006/main" noChangeAspect="1"/>
+            </wp:cNvGraphicFramePr>
+            <a:graphic xmlns:a="http://schemas.openxmlformats.org/drawingml/2006/main">
+              <a:graphicData uri="http://schemas.openxmlformats.org/drawingml/2006/picture">
+                <pic:pic xmlns:pic="http://schemas.openxmlformats.org/drawingml/2006/picture">
+                  <pic:nvPicPr>
+                    <pic:cNvPr id="393098949" name=""/>
+                    <pic:cNvPicPr/>
+                  </pic:nvPicPr>
+                  <pic:blipFill>
+                    <a:blip r:embed="rId19"/>
+                    <a:stretch>
+                      <a:fillRect/>
+                    </a:stretch>
+                  </pic:blipFill>
+                  <pic:spPr>
+                    <a:xfrm>
+                      <a:off x="0" y="0"/>
+                      <a:ext cx="5760720" cy="3531235"/>
+                    </a:xfrm>
+                    <a:prstGeom prst="rect">
+                      <a:avLst/>
+                    </a:prstGeom>
+                  </pic:spPr>
+                </pic:pic>
+              </a:graphicData>
+            </a:graphic>
+          </wp:inline>
+        </w:drawing>
+      </w:r>
+    </w:p>
+    <w:p/>
     <w:sectPr>
-      <w:headerReference w:type="default" r:id="rId13"/>
+      <w:headerReference w:type="default" r:id="rId20"/>
       <w:pgSz w:w="11906" w:h="16838"/>
       <w:pgMar w:top="1417" w:right="1417" w:bottom="1417" w:left="1417" w:header="708" w:footer="708" w:gutter="0"/>
       <w:cols w:space="708"/>
@@ -1038,6 +2621,95 @@
     </w:lvl>
   </w:abstractNum>
   <w:abstractNum w:abstractNumId="6" w15:restartNumberingAfterBreak="0">
+    <w:nsid w:val="586E405D"/>
+    <w:multiLevelType w:val="hybridMultilevel"/>
+    <w:tmpl w:val="99E21BBC"/>
+    <w:lvl w:ilvl="0" w:tplc="0405000F">
+      <w:start w:val="1"/>
+      <w:numFmt w:val="decimal"/>
+      <w:lvlText w:val="%1."/>
+      <w:lvlJc w:val="left"/>
+      <w:pPr>
+        <w:ind w:left="720" w:hanging="360"/>
+      </w:pPr>
+      <w:rPr>
+        <w:rFonts w:hint="default"/>
+      </w:rPr>
+    </w:lvl>
+    <w:lvl w:ilvl="1" w:tplc="04050019" w:tentative="1">
+      <w:start w:val="1"/>
+      <w:numFmt w:val="lowerLetter"/>
+      <w:lvlText w:val="%2."/>
+      <w:lvlJc w:val="left"/>
+      <w:pPr>
+        <w:ind w:left="1440" w:hanging="360"/>
+      </w:pPr>
+    </w:lvl>
+    <w:lvl w:ilvl="2" w:tplc="0405001B" w:tentative="1">
+      <w:start w:val="1"/>
+      <w:numFmt w:val="lowerRoman"/>
+      <w:lvlText w:val="%3."/>
+      <w:lvlJc w:val="right"/>
+      <w:pPr>
+        <w:ind w:left="2160" w:hanging="180"/>
+      </w:pPr>
+    </w:lvl>
+    <w:lvl w:ilvl="3" w:tplc="0405000F" w:tentative="1">
+      <w:start w:val="1"/>
+      <w:numFmt w:val="decimal"/>
+      <w:lvlText w:val="%4."/>
+      <w:lvlJc w:val="left"/>
+      <w:pPr>
+        <w:ind w:left="2880" w:hanging="360"/>
+      </w:pPr>
+    </w:lvl>
+    <w:lvl w:ilvl="4" w:tplc="04050019" w:tentative="1">
+      <w:start w:val="1"/>
+      <w:numFmt w:val="lowerLetter"/>
+      <w:lvlText w:val="%5."/>
+      <w:lvlJc w:val="left"/>
+      <w:pPr>
+        <w:ind w:left="3600" w:hanging="360"/>
+      </w:pPr>
+    </w:lvl>
+    <w:lvl w:ilvl="5" w:tplc="0405001B" w:tentative="1">
+      <w:start w:val="1"/>
+      <w:numFmt w:val="lowerRoman"/>
+      <w:lvlText w:val="%6."/>
+      <w:lvlJc w:val="right"/>
+      <w:pPr>
+        <w:ind w:left="4320" w:hanging="180"/>
+      </w:pPr>
+    </w:lvl>
+    <w:lvl w:ilvl="6" w:tplc="0405000F" w:tentative="1">
+      <w:start w:val="1"/>
+      <w:numFmt w:val="decimal"/>
+      <w:lvlText w:val="%7."/>
+      <w:lvlJc w:val="left"/>
+      <w:pPr>
+        <w:ind w:left="5040" w:hanging="360"/>
+      </w:pPr>
+    </w:lvl>
+    <w:lvl w:ilvl="7" w:tplc="04050019" w:tentative="1">
+      <w:start w:val="1"/>
+      <w:numFmt w:val="lowerLetter"/>
+      <w:lvlText w:val="%8."/>
+      <w:lvlJc w:val="left"/>
+      <w:pPr>
+        <w:ind w:left="5760" w:hanging="360"/>
+      </w:pPr>
+    </w:lvl>
+    <w:lvl w:ilvl="8" w:tplc="0405001B" w:tentative="1">
+      <w:start w:val="1"/>
+      <w:numFmt w:val="lowerRoman"/>
+      <w:lvlText w:val="%9."/>
+      <w:lvlJc w:val="right"/>
+      <w:pPr>
+        <w:ind w:left="6480" w:hanging="180"/>
+      </w:pPr>
+    </w:lvl>
+  </w:abstractNum>
+  <w:abstractNum w:abstractNumId="7" w15:restartNumberingAfterBreak="0">
     <w:nsid w:val="6BEF0558"/>
     <w:multiLevelType w:val="multilevel"/>
     <w:tmpl w:val="36A819BC"/>
@@ -1152,7 +2824,7 @@
       </w:rPr>
     </w:lvl>
   </w:abstractNum>
-  <w:abstractNum w:abstractNumId="7" w15:restartNumberingAfterBreak="0">
+  <w:abstractNum w:abstractNumId="8" w15:restartNumberingAfterBreak="0">
     <w:nsid w:val="71632532"/>
     <w:multiLevelType w:val="hybridMultilevel"/>
     <w:tmpl w:val="3C10B3BE"/>
@@ -1265,7 +2937,7 @@
       </w:rPr>
     </w:lvl>
   </w:abstractNum>
-  <w:abstractNum w:abstractNumId="8" w15:restartNumberingAfterBreak="0">
+  <w:abstractNum w:abstractNumId="9" w15:restartNumberingAfterBreak="0">
     <w:nsid w:val="75F750AA"/>
     <w:multiLevelType w:val="hybridMultilevel"/>
     <w:tmpl w:val="841C863A"/>
@@ -1393,7 +3065,7 @@
     </w:lvlOverride>
   </w:num>
   <w:num w:numId="5" w16cid:durableId="1402436969">
-    <w:abstractNumId w:val="7"/>
+    <w:abstractNumId w:val="8"/>
   </w:num>
   <w:num w:numId="6" w16cid:durableId="246497192">
     <w:abstractNumId w:val="2"/>
@@ -1426,7 +3098,7 @@
     </w:lvlOverride>
   </w:num>
   <w:num w:numId="11" w16cid:durableId="689840947">
-    <w:abstractNumId w:val="8"/>
+    <w:abstractNumId w:val="9"/>
   </w:num>
   <w:num w:numId="12" w16cid:durableId="650333171">
     <w:abstractNumId w:val="3"/>
@@ -1435,7 +3107,7 @@
     <w:abstractNumId w:val="4"/>
   </w:num>
   <w:num w:numId="14" w16cid:durableId="1956447237">
-    <w:abstractNumId w:val="6"/>
+    <w:abstractNumId w:val="7"/>
   </w:num>
   <w:num w:numId="15" w16cid:durableId="1138569866">
     <w:abstractNumId w:val="5"/>
@@ -1529,6 +3201,9 @@
   </w:num>
   <w:num w:numId="18" w16cid:durableId="1742871104">
     <w:abstractNumId w:val="0"/>
+  </w:num>
+  <w:num w:numId="19" w16cid:durableId="107310706">
+    <w:abstractNumId w:val="6"/>
   </w:num>
 </w:numbering>
 </file>

</xml_diff>

<commit_message>
feat: Úkol 2 – useState, useEffect, custom hook useWatchlist
</commit_message>
<xml_diff>
--- a/ReactJs (2).docx
+++ b/ReactJs (2).docx
@@ -157,6 +157,9 @@
     </w:p>
     <w:p>
       <w:r>
+        <w:rPr>
+          <w:noProof/>
+        </w:rPr>
         <w:lastRenderedPageBreak/>
         <w:drawing>
           <wp:inline distT="0" distB="0" distL="0" distR="0" wp14:anchorId="101FC4D2" wp14:editId="3D35E390">
@@ -205,6 +208,9 @@
     </w:p>
     <w:p>
       <w:r>
+        <w:rPr>
+          <w:noProof/>
+        </w:rPr>
         <w:drawing>
           <wp:inline distT="0" distB="0" distL="0" distR="0" wp14:anchorId="17D98DC1" wp14:editId="7272FF64">
             <wp:extent cx="5760720" cy="2086610"/>
@@ -281,6 +287,9 @@
     </w:p>
     <w:p>
       <w:r>
+        <w:rPr>
+          <w:noProof/>
+        </w:rPr>
         <w:drawing>
           <wp:inline distT="0" distB="0" distL="0" distR="0" wp14:anchorId="793A1DE0" wp14:editId="622DBBD1">
             <wp:extent cx="5760720" cy="2385060"/>
@@ -364,6 +373,9 @@
     </w:p>
     <w:p>
       <w:r>
+        <w:rPr>
+          <w:noProof/>
+        </w:rPr>
         <w:drawing>
           <wp:inline distT="0" distB="0" distL="0" distR="0" wp14:anchorId="01B4A6BA" wp14:editId="63BC5CB5">
             <wp:extent cx="5760720" cy="826135"/>
@@ -1508,6 +1520,9 @@
     </w:p>
     <w:p>
       <w:r>
+        <w:rPr>
+          <w:noProof/>
+        </w:rPr>
         <w:drawing>
           <wp:inline distT="0" distB="0" distL="0" distR="0" wp14:anchorId="162CC483" wp14:editId="270371DC">
             <wp:extent cx="5760720" cy="2283460"/>
@@ -1555,6 +1570,9 @@
     </w:p>
     <w:p>
       <w:r>
+        <w:rPr>
+          <w:noProof/>
+        </w:rPr>
         <w:drawing>
           <wp:inline distT="0" distB="0" distL="0" distR="0" wp14:anchorId="1987A005" wp14:editId="4B4BFC68">
             <wp:extent cx="5760720" cy="2299970"/>
@@ -1602,6 +1620,9 @@
     </w:p>
     <w:p>
       <w:r>
+        <w:rPr>
+          <w:noProof/>
+        </w:rPr>
         <w:drawing>
           <wp:inline distT="0" distB="0" distL="0" distR="0" wp14:anchorId="1FC526CB" wp14:editId="1D96AB55">
             <wp:extent cx="5760720" cy="2256790"/>
@@ -1650,6 +1671,9 @@
     </w:p>
     <w:p>
       <w:r>
+        <w:rPr>
+          <w:noProof/>
+        </w:rPr>
         <w:drawing>
           <wp:inline distT="0" distB="0" distL="0" distR="0" wp14:anchorId="482B096C" wp14:editId="26E25D80">
             <wp:extent cx="5760720" cy="2163445"/>
@@ -1697,6 +1721,11 @@
     </w:p>
     <w:p>
       <w:r>
+        <w:t>Zjednodušeně znovupoužitelný element definovaný funkcí, která vrací JSX</w:t>
+      </w:r>
+    </w:p>
+    <w:p>
+      <w:r>
         <w:t xml:space="preserve">Komponenta je samostatná část uživatelského rozhraní. Může to být tlačítko, karta filmu, formulář, navigace nebo celá stránka. V </w:t>
       </w:r>
       <w:proofErr w:type="spellStart"/>
@@ -1710,6 +1739,9 @@
     </w:p>
     <w:p>
       <w:r>
+        <w:rPr>
+          <w:noProof/>
+        </w:rPr>
         <w:drawing>
           <wp:inline distT="0" distB="0" distL="0" distR="0" wp14:anchorId="2D63B175" wp14:editId="7BFF4A3B">
             <wp:extent cx="5760720" cy="1711960"/>
@@ -1796,6 +1828,9 @@
     </w:p>
     <w:p>
       <w:r>
+        <w:rPr>
+          <w:noProof/>
+        </w:rPr>
         <w:lastRenderedPageBreak/>
         <w:drawing>
           <wp:inline distT="0" distB="0" distL="0" distR="0" wp14:anchorId="45AD1523" wp14:editId="35E69BA0">
@@ -1872,6 +1907,9 @@
     </w:p>
     <w:p>
       <w:r>
+        <w:rPr>
+          <w:noProof/>
+        </w:rPr>
         <w:drawing>
           <wp:inline distT="0" distB="0" distL="0" distR="0" wp14:anchorId="040D6C4B" wp14:editId="7B81512E">
             <wp:extent cx="5760720" cy="3531235"/>
@@ -1909,9 +1947,343 @@
         </w:drawing>
       </w:r>
     </w:p>
+    <w:p>
+      <w:pPr>
+        <w:pStyle w:val="Nadpis1"/>
+      </w:pPr>
+      <w:proofErr w:type="spellStart"/>
+      <w:r>
+        <w:lastRenderedPageBreak/>
+        <w:t>Hooks</w:t>
+      </w:r>
+      <w:proofErr w:type="spellEnd"/>
+    </w:p>
+    <w:p>
+      <w:r>
+        <w:t xml:space="preserve">Funkce, které umožňují </w:t>
+      </w:r>
+      <w:proofErr w:type="spellStart"/>
+      <w:r>
+        <w:t>komponenám</w:t>
+      </w:r>
+      <w:proofErr w:type="spellEnd"/>
+      <w:r>
+        <w:t xml:space="preserve"> využívat </w:t>
+      </w:r>
+      <w:proofErr w:type="spellStart"/>
+      <w:r>
+        <w:t>React</w:t>
+      </w:r>
+      <w:proofErr w:type="spellEnd"/>
+      <w:r>
+        <w:t xml:space="preserve"> </w:t>
+      </w:r>
+      <w:proofErr w:type="spellStart"/>
+      <w:r>
+        <w:t>featury</w:t>
+      </w:r>
+      <w:proofErr w:type="spellEnd"/>
+      <w:r>
+        <w:t>.</w:t>
+      </w:r>
+    </w:p>
+    <w:p>
+      <w:r>
+        <w:t>…</w:t>
+      </w:r>
+    </w:p>
+    <w:p>
+      <w:pPr>
+        <w:pStyle w:val="Nadpis2"/>
+      </w:pPr>
+      <w:proofErr w:type="spellStart"/>
+      <w:r>
+        <w:t>Lifecycle</w:t>
+      </w:r>
+      <w:proofErr w:type="spellEnd"/>
+      <w:r>
+        <w:t xml:space="preserve"> </w:t>
+      </w:r>
+      <w:proofErr w:type="spellStart"/>
+      <w:r>
+        <w:t>componenty</w:t>
+      </w:r>
+      <w:proofErr w:type="spellEnd"/>
+    </w:p>
+    <w:p>
+      <w:pPr>
+        <w:pStyle w:val="Nadpis3"/>
+      </w:pPr>
+      <w:r>
+        <w:t>Mount</w:t>
+      </w:r>
+    </w:p>
+    <w:p>
+      <w:r>
+        <w:t xml:space="preserve">Komponenta se </w:t>
+      </w:r>
+      <w:proofErr w:type="spellStart"/>
+      <w:r>
+        <w:t>distabe</w:t>
+      </w:r>
+      <w:proofErr w:type="spellEnd"/>
+      <w:r>
+        <w:t xml:space="preserve"> do DOM</w:t>
+      </w:r>
+    </w:p>
+    <w:p>
+      <w:pPr>
+        <w:pStyle w:val="Nadpis3"/>
+      </w:pPr>
+      <w:proofErr w:type="spellStart"/>
+      <w:r>
+        <w:t>Render</w:t>
+      </w:r>
+      <w:proofErr w:type="spellEnd"/>
+    </w:p>
+    <w:p/>
+    <w:p>
+      <w:pPr>
+        <w:pStyle w:val="Nadpis3"/>
+      </w:pPr>
+      <w:r>
+        <w:t>Update</w:t>
+      </w:r>
+    </w:p>
+    <w:p/>
+    <w:p>
+      <w:pPr>
+        <w:pStyle w:val="Nadpis3"/>
+      </w:pPr>
+      <w:proofErr w:type="spellStart"/>
+      <w:r>
+        <w:t>Unmount</w:t>
+      </w:r>
+      <w:proofErr w:type="spellEnd"/>
+    </w:p>
+    <w:p>
+      <w:r>
+        <w:t>….</w:t>
+      </w:r>
+    </w:p>
+    <w:p>
+      <w:pPr>
+        <w:pStyle w:val="Nadpis2"/>
+      </w:pPr>
+      <w:proofErr w:type="spellStart"/>
+      <w:r>
+        <w:t>UseState</w:t>
+      </w:r>
+      <w:proofErr w:type="spellEnd"/>
+    </w:p>
+    <w:p>
+      <w:r>
+        <w:t>…</w:t>
+      </w:r>
+    </w:p>
+    <w:p>
+      <w:pPr>
+        <w:pStyle w:val="Nadpis2"/>
+      </w:pPr>
+      <w:proofErr w:type="spellStart"/>
+      <w:r>
+        <w:t>UseEffect</w:t>
+      </w:r>
+      <w:proofErr w:type="spellEnd"/>
+    </w:p>
+    <w:p>
+      <w:r>
+        <w:t xml:space="preserve">Používá se pro kód, který má proběhnout až </w:t>
+      </w:r>
+      <w:proofErr w:type="spellStart"/>
+      <w:r>
+        <w:t>pootm</w:t>
+      </w:r>
+      <w:proofErr w:type="spellEnd"/>
+      <w:r>
+        <w:t xml:space="preserve">, co je </w:t>
+      </w:r>
+      <w:proofErr w:type="spellStart"/>
+      <w:r>
+        <w:t>komponentea</w:t>
+      </w:r>
+      <w:proofErr w:type="spellEnd"/>
+      <w:r>
+        <w:t xml:space="preserve"> vykreslena nebo když s ní chceme pracovat v rámci </w:t>
+      </w:r>
+      <w:proofErr w:type="spellStart"/>
+      <w:r>
+        <w:t>lifecycle</w:t>
+      </w:r>
+      <w:proofErr w:type="spellEnd"/>
+    </w:p>
+    <w:p>
+      <w:pPr>
+        <w:pStyle w:val="Nadpis3"/>
+      </w:pPr>
+      <w:proofErr w:type="spellStart"/>
+      <w:r>
+        <w:t>Side</w:t>
+      </w:r>
+      <w:proofErr w:type="spellEnd"/>
+      <w:r>
+        <w:t xml:space="preserve"> </w:t>
+      </w:r>
+      <w:proofErr w:type="spellStart"/>
+      <w:r>
+        <w:t>effecty</w:t>
+      </w:r>
+      <w:proofErr w:type="spellEnd"/>
+    </w:p>
+    <w:p>
+      <w:r>
+        <w:t>….</w:t>
+      </w:r>
+    </w:p>
+    <w:p>
+      <w:pPr>
+        <w:pStyle w:val="Nadpis2"/>
+      </w:pPr>
+      <w:proofErr w:type="spellStart"/>
+      <w:r>
+        <w:t>useRef</w:t>
+      </w:r>
+      <w:proofErr w:type="spellEnd"/>
+    </w:p>
+    <w:p>
+      <w:pPr>
+        <w:pStyle w:val="Nadpis2"/>
+      </w:pPr>
+      <w:proofErr w:type="spellStart"/>
+      <w:r>
+        <w:t>useMemo</w:t>
+      </w:r>
+      <w:proofErr w:type="spellEnd"/>
+    </w:p>
+    <w:p>
+      <w:pPr>
+        <w:pStyle w:val="Nadpis2"/>
+      </w:pPr>
+      <w:proofErr w:type="spellStart"/>
+      <w:r>
+        <w:t>Custom</w:t>
+      </w:r>
+      <w:proofErr w:type="spellEnd"/>
+      <w:r>
+        <w:t xml:space="preserve"> </w:t>
+      </w:r>
+      <w:proofErr w:type="spellStart"/>
+      <w:r>
+        <w:t>hooks</w:t>
+      </w:r>
+      <w:proofErr w:type="spellEnd"/>
+    </w:p>
+    <w:p>
+      <w:proofErr w:type="spellStart"/>
+      <w:r>
+        <w:t>Custom</w:t>
+      </w:r>
+      <w:proofErr w:type="spellEnd"/>
+      <w:r>
+        <w:t xml:space="preserve"> </w:t>
+      </w:r>
+      <w:proofErr w:type="spellStart"/>
+      <w:r>
+        <w:t>hook</w:t>
+      </w:r>
+      <w:proofErr w:type="spellEnd"/>
+      <w:r>
+        <w:t xml:space="preserve"> je vlastní funkce, která začíná slovem use a může uvnitř používat jiné </w:t>
+      </w:r>
+      <w:proofErr w:type="spellStart"/>
+      <w:r>
+        <w:t>hooky</w:t>
+      </w:r>
+      <w:proofErr w:type="spellEnd"/>
+      <w:r>
+        <w:t xml:space="preserve">. Slouží k tomu, abychom logiku nemuseli opakovat ve více komponentách. Logika znamená pravidla a chování aplikace, například práce s formulářem, </w:t>
+      </w:r>
+      <w:proofErr w:type="spellStart"/>
+      <w:r>
+        <w:t>localStorage</w:t>
+      </w:r>
+      <w:proofErr w:type="spellEnd"/>
+      <w:r>
+        <w:t xml:space="preserve"> nebo načítáním dat. Komponenta pak zůstane přehlednější, protože se víc soustředí na zobrazení.</w:t>
+      </w:r>
+    </w:p>
+    <w:p>
+      <w:r>
+        <w:lastRenderedPageBreak/>
+        <w:drawing>
+          <wp:inline distT="0" distB="0" distL="0" distR="0" wp14:anchorId="1491525E" wp14:editId="26118AEF">
+            <wp:extent cx="5044877" cy="4663844"/>
+            <wp:effectExtent l="0" t="0" r="3810" b="3810"/>
+            <wp:docPr id="249174393" name="Obrázek 1"/>
+            <wp:cNvGraphicFramePr>
+              <a:graphicFrameLocks xmlns:a="http://schemas.openxmlformats.org/drawingml/2006/main" noChangeAspect="1"/>
+            </wp:cNvGraphicFramePr>
+            <a:graphic xmlns:a="http://schemas.openxmlformats.org/drawingml/2006/main">
+              <a:graphicData uri="http://schemas.openxmlformats.org/drawingml/2006/picture">
+                <pic:pic xmlns:pic="http://schemas.openxmlformats.org/drawingml/2006/picture">
+                  <pic:nvPicPr>
+                    <pic:cNvPr id="249174393" name=""/>
+                    <pic:cNvPicPr/>
+                  </pic:nvPicPr>
+                  <pic:blipFill>
+                    <a:blip r:embed="rId20"/>
+                    <a:stretch>
+                      <a:fillRect/>
+                    </a:stretch>
+                  </pic:blipFill>
+                  <pic:spPr>
+                    <a:xfrm>
+                      <a:off x="0" y="0"/>
+                      <a:ext cx="5044877" cy="4663844"/>
+                    </a:xfrm>
+                    <a:prstGeom prst="rect">
+                      <a:avLst/>
+                    </a:prstGeom>
+                  </pic:spPr>
+                </pic:pic>
+              </a:graphicData>
+            </a:graphic>
+          </wp:inline>
+        </w:drawing>
+      </w:r>
+    </w:p>
+    <w:p>
+      <w:pPr>
+        <w:pStyle w:val="Nadpis1"/>
+      </w:pPr>
+      <w:r>
+        <w:t>State management</w:t>
+      </w:r>
+    </w:p>
+    <w:p>
+      <w:r>
+        <w:t>V malé komponentě je práce se stavem jednoduchá: komponenta si hodnotu uloží přes </w:t>
+      </w:r>
+      <w:proofErr w:type="spellStart"/>
+      <w:r>
+        <w:t>useState</w:t>
+      </w:r>
+      <w:proofErr w:type="spellEnd"/>
+      <w:r>
+        <w:t xml:space="preserve"> a sama ji také mění. U větší aplikace ale často nastane otázka, kde mají data vlastně bydlet. Když stejná data potřebuje více komponent, není dobré je kopírovat na více míst. Místo toho hledáme jedno společné místo, odkud se data čtou a kde se také mění. Právě tomu říkáme </w:t>
+      </w:r>
+      <w:proofErr w:type="spellStart"/>
+      <w:r>
+        <w:t>state</w:t>
+      </w:r>
+      <w:proofErr w:type="spellEnd"/>
+      <w:r>
+        <w:t xml:space="preserve"> management. Cílem není použít co nejsložitější nástroj, ale zvolit nejjednodušší řešení, které je pro danou situaci přehledné.</w:t>
+      </w:r>
+    </w:p>
     <w:p/>
     <w:sectPr>
-      <w:headerReference w:type="default" r:id="rId20"/>
+      <w:headerReference w:type="default" r:id="rId21"/>
       <w:pgSz w:w="11906" w:h="16838"/>
       <w:pgMar w:top="1417" w:right="1417" w:bottom="1417" w:left="1417" w:header="708" w:footer="708" w:gutter="0"/>
       <w:cols w:space="708"/>

</xml_diff>

<commit_message>
feat: Úkol 4 – stylovaání, CSS modules
</commit_message>
<xml_diff>
--- a/ReactJs (2).docx
+++ b/ReactJs (2).docx
@@ -96,13 +96,8 @@
         <w:pStyle w:val="Nadpis2"/>
       </w:pPr>
       <w:r>
-        <w:t xml:space="preserve">Build a </w:t>
-      </w:r>
-      <w:proofErr w:type="spellStart"/>
-      <w:r>
-        <w:t>Transpilace</w:t>
-      </w:r>
-      <w:proofErr w:type="spellEnd"/>
+        <w:t>Build a Transpilace</w:t>
+      </w:r>
     </w:p>
     <w:p>
       <w:r>
@@ -113,11 +108,9 @@
       <w:pPr>
         <w:pStyle w:val="Nadpis1"/>
       </w:pPr>
-      <w:proofErr w:type="spellStart"/>
       <w:r>
         <w:t>Typescript</w:t>
       </w:r>
-      <w:proofErr w:type="spellEnd"/>
     </w:p>
     <w:p>
       <w:pPr>
@@ -139,15 +132,7 @@
     </w:p>
     <w:p>
       <w:r>
-        <w:t xml:space="preserve">Umožňuje </w:t>
-      </w:r>
-      <w:proofErr w:type="spellStart"/>
-      <w:r>
-        <w:t>autocomplete</w:t>
-      </w:r>
-      <w:proofErr w:type="spellEnd"/>
-      <w:r>
-        <w:t xml:space="preserve"> v IDE.</w:t>
+        <w:t>Umožňuje autocomplete v IDE.</w:t>
       </w:r>
     </w:p>
     <w:p>
@@ -258,31 +243,7 @@
     </w:p>
     <w:p>
       <w:r>
-        <w:t xml:space="preserve">Interface popisuje, jak má vypadat objekt. Objekt je hodnota, která obsahuje pojmenované vlastnosti, například uživatel může mít id, </w:t>
-      </w:r>
-      <w:proofErr w:type="spellStart"/>
-      <w:r>
-        <w:t>name</w:t>
-      </w:r>
-      <w:proofErr w:type="spellEnd"/>
-      <w:r>
-        <w:t xml:space="preserve"> a email. Interface tedy neurčuje konkrétního uživatele, ale pravidla pro to, jaké vlastnosti má uživatelský objekt mít. V </w:t>
-      </w:r>
-      <w:proofErr w:type="spellStart"/>
-      <w:r>
-        <w:t>Reactu</w:t>
-      </w:r>
-      <w:proofErr w:type="spellEnd"/>
-      <w:r>
-        <w:t xml:space="preserve"> se interface často používá pro </w:t>
-      </w:r>
-      <w:proofErr w:type="spellStart"/>
-      <w:r>
-        <w:t>props</w:t>
-      </w:r>
-      <w:proofErr w:type="spellEnd"/>
-      <w:r>
-        <w:t>, tedy data, která posíláme z rodičovské komponenty do dětské komponenty.</w:t>
+        <w:t>Interface popisuje, jak má vypadat objekt. Objekt je hodnota, která obsahuje pojmenované vlastnosti, například uživatel může mít id, name a email. Interface tedy neurčuje konkrétního uživatele, ale pravidla pro to, jaké vlastnosti má uživatelský objekt mít. V Reactu se interface často používá pro props, tedy data, která posíláme z rodičovské komponenty do dětské komponenty.</w:t>
       </w:r>
     </w:p>
     <w:p>
@@ -342,33 +303,12 @@
       </w:pPr>
       <w:r>
         <w:lastRenderedPageBreak/>
-        <w:t xml:space="preserve">Type </w:t>
-      </w:r>
-      <w:proofErr w:type="spellStart"/>
-      <w:r>
-        <w:t>aliases</w:t>
-      </w:r>
-      <w:proofErr w:type="spellEnd"/>
-    </w:p>
-    <w:p>
-      <w:r>
-        <w:t xml:space="preserve">Umožňuje definovat, jakých konkrétních </w:t>
-      </w:r>
-      <w:proofErr w:type="spellStart"/>
-      <w:r>
-        <w:t>hodot</w:t>
-      </w:r>
-      <w:proofErr w:type="spellEnd"/>
-      <w:r>
-        <w:t xml:space="preserve"> proměnné </w:t>
-      </w:r>
-      <w:proofErr w:type="spellStart"/>
-      <w:r>
-        <w:t>nabívají</w:t>
-      </w:r>
-      <w:proofErr w:type="spellEnd"/>
-      <w:r>
-        <w:t>.</w:t>
+        <w:t>Type aliases</w:t>
+      </w:r>
+    </w:p>
+    <w:p>
+      <w:r>
+        <w:t>Umožňuje definovat, jakých konkrétních hodot proměnné nabívají.</w:t>
       </w:r>
     </w:p>
     <w:p>
@@ -417,37 +357,17 @@
       <w:pPr>
         <w:pStyle w:val="Nadpis1"/>
       </w:pPr>
-      <w:proofErr w:type="spellStart"/>
-      <w:r>
-        <w:t>React</w:t>
-      </w:r>
-      <w:proofErr w:type="spellEnd"/>
-      <w:r>
-        <w:t xml:space="preserve"> </w:t>
-      </w:r>
-      <w:proofErr w:type="spellStart"/>
-      <w:r>
-        <w:t>best</w:t>
-      </w:r>
-      <w:proofErr w:type="spellEnd"/>
-      <w:r>
-        <w:t xml:space="preserve"> </w:t>
-      </w:r>
-      <w:proofErr w:type="spellStart"/>
-      <w:r>
-        <w:t>practices</w:t>
-      </w:r>
-      <w:proofErr w:type="spellEnd"/>
+      <w:r>
+        <w:t>React best practices</w:t>
+      </w:r>
     </w:p>
     <w:p>
       <w:pPr>
         <w:pStyle w:val="Nadpis2"/>
       </w:pPr>
-      <w:proofErr w:type="spellStart"/>
       <w:r>
         <w:t>Naming</w:t>
       </w:r>
-      <w:proofErr w:type="spellEnd"/>
     </w:p>
     <w:tbl>
       <w:tblPr>
@@ -480,13 +400,8 @@
             <w:pPr>
               <w:jc w:val="center"/>
             </w:pPr>
-            <w:proofErr w:type="spellStart"/>
             <w:r>
-              <w:t>React</w:t>
-            </w:r>
-            <w:proofErr w:type="spellEnd"/>
-            <w:r>
-              <w:t xml:space="preserve"> komponenta</w:t>
+              <w:t>React komponenta</w:t>
             </w:r>
           </w:p>
         </w:tc>
@@ -504,19 +419,9 @@
             <w:pPr>
               <w:jc w:val="center"/>
             </w:pPr>
-            <w:proofErr w:type="spellStart"/>
             <w:r>
-              <w:t>PascalCase</w:t>
+              <w:t>PascalCase + .tsx</w:t>
             </w:r>
-            <w:proofErr w:type="spellEnd"/>
-            <w:r>
-              <w:t xml:space="preserve"> + .</w:t>
-            </w:r>
-            <w:proofErr w:type="spellStart"/>
-            <w:r>
-              <w:t>tsx</w:t>
-            </w:r>
-            <w:proofErr w:type="spellEnd"/>
           </w:p>
         </w:tc>
         <w:tc>
@@ -533,19 +438,9 @@
             <w:pPr>
               <w:jc w:val="center"/>
             </w:pPr>
-            <w:proofErr w:type="spellStart"/>
             <w:r>
-              <w:t>UserCard.tsx</w:t>
+              <w:t>UserCard.tsx, NavigationMenu.tsx</w:t>
             </w:r>
-            <w:proofErr w:type="spellEnd"/>
-            <w:r>
-              <w:t xml:space="preserve">, </w:t>
-            </w:r>
-            <w:proofErr w:type="spellStart"/>
-            <w:r>
-              <w:t>NavigationMenu.tsx</w:t>
-            </w:r>
-            <w:proofErr w:type="spellEnd"/>
           </w:p>
         </w:tc>
       </w:tr>
@@ -564,19 +459,9 @@
             <w:pPr>
               <w:jc w:val="center"/>
             </w:pPr>
-            <w:proofErr w:type="spellStart"/>
             <w:r>
-              <w:t>Custom</w:t>
+              <w:t>Custom hook</w:t>
             </w:r>
-            <w:proofErr w:type="spellEnd"/>
-            <w:r>
-              <w:t xml:space="preserve"> </w:t>
-            </w:r>
-            <w:proofErr w:type="spellStart"/>
-            <w:r>
-              <w:t>hook</w:t>
-            </w:r>
-            <w:proofErr w:type="spellEnd"/>
           </w:p>
         </w:tc>
         <w:tc>
@@ -593,19 +478,9 @@
             <w:pPr>
               <w:jc w:val="center"/>
             </w:pPr>
-            <w:proofErr w:type="spellStart"/>
             <w:r>
-              <w:t>camelCase</w:t>
+              <w:t>camelCase, začíná "use" + .ts</w:t>
             </w:r>
-            <w:proofErr w:type="spellEnd"/>
-            <w:r>
-              <w:t>, začíná "use" + .</w:t>
-            </w:r>
-            <w:proofErr w:type="spellStart"/>
-            <w:r>
-              <w:t>ts</w:t>
-            </w:r>
-            <w:proofErr w:type="spellEnd"/>
           </w:p>
         </w:tc>
         <w:tc>
@@ -622,19 +497,9 @@
             <w:pPr>
               <w:jc w:val="center"/>
             </w:pPr>
-            <w:proofErr w:type="spellStart"/>
             <w:r>
-              <w:t>useWindowSize.ts</w:t>
+              <w:t>useWindowSize.ts, useDebounce.ts</w:t>
             </w:r>
-            <w:proofErr w:type="spellEnd"/>
-            <w:r>
-              <w:t xml:space="preserve">, </w:t>
-            </w:r>
-            <w:proofErr w:type="spellStart"/>
-            <w:r>
-              <w:t>useDebounce.ts</w:t>
-            </w:r>
-            <w:proofErr w:type="spellEnd"/>
           </w:p>
         </w:tc>
       </w:tr>
@@ -672,19 +537,9 @@
             <w:pPr>
               <w:jc w:val="center"/>
             </w:pPr>
-            <w:proofErr w:type="spellStart"/>
             <w:r>
-              <w:t>camelCase</w:t>
+              <w:t>camelCase + .ts</w:t>
             </w:r>
-            <w:proofErr w:type="spellEnd"/>
-            <w:r>
-              <w:t xml:space="preserve"> + .</w:t>
-            </w:r>
-            <w:proofErr w:type="spellStart"/>
-            <w:r>
-              <w:t>ts</w:t>
-            </w:r>
-            <w:proofErr w:type="spellEnd"/>
           </w:p>
         </w:tc>
         <w:tc>
@@ -701,103 +556,9 @@
             <w:pPr>
               <w:jc w:val="center"/>
             </w:pPr>
-            <w:proofErr w:type="spellStart"/>
             <w:r>
-              <w:t>formatCurrency.ts</w:t>
+              <w:t>formatCurrency.ts, parseDate.ts</w:t>
             </w:r>
-            <w:proofErr w:type="spellEnd"/>
-            <w:r>
-              <w:t xml:space="preserve">, </w:t>
-            </w:r>
-            <w:proofErr w:type="spellStart"/>
-            <w:r>
-              <w:t>parseDate.ts</w:t>
-            </w:r>
-            <w:proofErr w:type="spellEnd"/>
-          </w:p>
-        </w:tc>
-      </w:tr>
-      <w:tr>
-        <w:tc>
-          <w:tcPr>
-            <w:tcW w:w="2127" w:type="dxa"/>
-            <w:tcBorders>
-              <w:bottom w:val="single" w:sz="4" w:space="0" w:color="D3D1C7"/>
-            </w:tcBorders>
-            <w:shd w:val="clear" w:color="auto" w:fill="F1EFE8"/>
-            <w:vAlign w:val="center"/>
-            <w:hideMark/>
-          </w:tcPr>
-          <w:p>
-            <w:pPr>
-              <w:jc w:val="center"/>
-            </w:pPr>
-            <w:proofErr w:type="spellStart"/>
-            <w:r>
-              <w:t>TypeScript</w:t>
-            </w:r>
-            <w:proofErr w:type="spellEnd"/>
-            <w:r>
-              <w:t xml:space="preserve"> typy</w:t>
-            </w:r>
-          </w:p>
-        </w:tc>
-        <w:tc>
-          <w:tcPr>
-            <w:tcW w:w="3139" w:type="dxa"/>
-            <w:tcBorders>
-              <w:bottom w:val="single" w:sz="4" w:space="0" w:color="D3D1C7"/>
-            </w:tcBorders>
-            <w:shd w:val="clear" w:color="auto" w:fill="F1EFE8"/>
-            <w:vAlign w:val="center"/>
-            <w:hideMark/>
-          </w:tcPr>
-          <w:p>
-            <w:pPr>
-              <w:jc w:val="center"/>
-            </w:pPr>
-            <w:proofErr w:type="spellStart"/>
-            <w:r>
-              <w:t>PascalCase</w:t>
-            </w:r>
-            <w:proofErr w:type="spellEnd"/>
-            <w:r>
-              <w:t xml:space="preserve"> + .</w:t>
-            </w:r>
-            <w:proofErr w:type="spellStart"/>
-            <w:r>
-              <w:t>ts</w:t>
-            </w:r>
-            <w:proofErr w:type="spellEnd"/>
-          </w:p>
-        </w:tc>
-        <w:tc>
-          <w:tcPr>
-            <w:tcW w:w="4232" w:type="dxa"/>
-            <w:tcBorders>
-              <w:bottom w:val="single" w:sz="4" w:space="0" w:color="D3D1C7"/>
-            </w:tcBorders>
-            <w:shd w:val="clear" w:color="auto" w:fill="F1EFE8"/>
-            <w:vAlign w:val="center"/>
-            <w:hideMark/>
-          </w:tcPr>
-          <w:p>
-            <w:pPr>
-              <w:jc w:val="center"/>
-            </w:pPr>
-            <w:proofErr w:type="spellStart"/>
-            <w:r>
-              <w:t>UserProfile.ts</w:t>
-            </w:r>
-            <w:proofErr w:type="spellEnd"/>
-            <w:r>
-              <w:t xml:space="preserve">, </w:t>
-            </w:r>
-            <w:proofErr w:type="spellStart"/>
-            <w:r>
-              <w:t>ApiError.ts</w:t>
-            </w:r>
-            <w:proofErr w:type="spellEnd"/>
           </w:p>
         </w:tc>
       </w:tr>
@@ -817,13 +578,8 @@
               <w:jc w:val="center"/>
             </w:pPr>
             <w:r>
-              <w:t>Stránka/</w:t>
+              <w:t>TypeScript typy</w:t>
             </w:r>
-            <w:proofErr w:type="spellStart"/>
-            <w:r>
-              <w:t>route</w:t>
-            </w:r>
-            <w:proofErr w:type="spellEnd"/>
           </w:p>
         </w:tc>
         <w:tc>
@@ -840,19 +596,9 @@
             <w:pPr>
               <w:jc w:val="center"/>
             </w:pPr>
-            <w:proofErr w:type="spellStart"/>
             <w:r>
-              <w:t>PascalCase</w:t>
+              <w:t>PascalCase + .ts</w:t>
             </w:r>
-            <w:proofErr w:type="spellEnd"/>
-            <w:r>
-              <w:t xml:space="preserve"> + </w:t>
-            </w:r>
-            <w:proofErr w:type="spellStart"/>
-            <w:r>
-              <w:t>Page.tsx</w:t>
-            </w:r>
-            <w:proofErr w:type="spellEnd"/>
           </w:p>
         </w:tc>
         <w:tc>
@@ -869,19 +615,68 @@
             <w:pPr>
               <w:jc w:val="center"/>
             </w:pPr>
-            <w:proofErr w:type="spellStart"/>
             <w:r>
-              <w:t>DashboardPage.tsx</w:t>
+              <w:t>UserProfile.ts, ApiError.ts</w:t>
             </w:r>
-            <w:proofErr w:type="spellEnd"/>
+          </w:p>
+        </w:tc>
+      </w:tr>
+      <w:tr>
+        <w:tc>
+          <w:tcPr>
+            <w:tcW w:w="2127" w:type="dxa"/>
+            <w:tcBorders>
+              <w:bottom w:val="single" w:sz="4" w:space="0" w:color="D3D1C7"/>
+            </w:tcBorders>
+            <w:shd w:val="clear" w:color="auto" w:fill="F1EFE8"/>
+            <w:vAlign w:val="center"/>
+            <w:hideMark/>
+          </w:tcPr>
+          <w:p>
+            <w:pPr>
+              <w:jc w:val="center"/>
+            </w:pPr>
             <w:r>
-              <w:t xml:space="preserve">, </w:t>
+              <w:t>Stránka/route</w:t>
             </w:r>
-            <w:proofErr w:type="spellStart"/>
+          </w:p>
+        </w:tc>
+        <w:tc>
+          <w:tcPr>
+            <w:tcW w:w="3139" w:type="dxa"/>
+            <w:tcBorders>
+              <w:bottom w:val="single" w:sz="4" w:space="0" w:color="D3D1C7"/>
+            </w:tcBorders>
+            <w:shd w:val="clear" w:color="auto" w:fill="F1EFE8"/>
+            <w:vAlign w:val="center"/>
+            <w:hideMark/>
+          </w:tcPr>
+          <w:p>
+            <w:pPr>
+              <w:jc w:val="center"/>
+            </w:pPr>
             <w:r>
-              <w:t>LoginPage.tsx</w:t>
+              <w:t>PascalCase + Page.tsx</w:t>
             </w:r>
-            <w:proofErr w:type="spellEnd"/>
+          </w:p>
+        </w:tc>
+        <w:tc>
+          <w:tcPr>
+            <w:tcW w:w="4232" w:type="dxa"/>
+            <w:tcBorders>
+              <w:bottom w:val="single" w:sz="4" w:space="0" w:color="D3D1C7"/>
+            </w:tcBorders>
+            <w:shd w:val="clear" w:color="auto" w:fill="F1EFE8"/>
+            <w:vAlign w:val="center"/>
+            <w:hideMark/>
+          </w:tcPr>
+          <w:p>
+            <w:pPr>
+              <w:jc w:val="center"/>
+            </w:pPr>
+            <w:r>
+              <w:t>DashboardPage.tsx, LoginPage.tsx</w:t>
+            </w:r>
           </w:p>
         </w:tc>
       </w:tr>
@@ -998,15 +793,7 @@
               <w:jc w:val="center"/>
             </w:pPr>
             <w:r>
-              <w:t>.user-</w:t>
-            </w:r>
-            <w:proofErr w:type="spellStart"/>
-            <w:r>
-              <w:t>card</w:t>
-            </w:r>
-            <w:proofErr w:type="spellEnd"/>
-            <w:r>
-              <w:t>, .nav-menu</w:t>
+              <w:t>.user-card, .nav-menu</w:t>
             </w:r>
           </w:p>
         </w:tc>
@@ -1017,15 +804,7 @@
         <w:pStyle w:val="Nadpis2"/>
       </w:pPr>
       <w:r>
-        <w:t xml:space="preserve">Pravidla pro </w:t>
-      </w:r>
-      <w:proofErr w:type="spellStart"/>
-      <w:r>
-        <w:t>react</w:t>
-      </w:r>
-      <w:proofErr w:type="spellEnd"/>
-      <w:r>
-        <w:t xml:space="preserve"> komponenty</w:t>
+        <w:t>Pravidla pro react komponenty</w:t>
       </w:r>
     </w:p>
     <w:p>
@@ -1086,120 +865,8 @@
             <w:pPr>
               <w:jc w:val="center"/>
             </w:pPr>
-            <w:proofErr w:type="spellStart"/>
             <w:r>
               <w:t>UserCardWithFormAndModal.tsx</w:t>
-            </w:r>
-            <w:proofErr w:type="spellEnd"/>
-          </w:p>
-        </w:tc>
-        <w:tc>
-          <w:tcPr>
-            <w:tcW w:w="5104" w:type="dxa"/>
-            <w:tcBorders>
-              <w:bottom w:val="single" w:sz="4" w:space="0" w:color="D3D1C7"/>
-            </w:tcBorders>
-            <w:shd w:val="clear" w:color="auto" w:fill="F1EFE8"/>
-            <w:vAlign w:val="center"/>
-            <w:hideMark/>
-          </w:tcPr>
-          <w:p>
-            <w:pPr>
-              <w:jc w:val="center"/>
-            </w:pPr>
-            <w:proofErr w:type="spellStart"/>
-            <w:r>
-              <w:t>UserCard.tsx</w:t>
-            </w:r>
-            <w:proofErr w:type="spellEnd"/>
-            <w:r>
-              <w:t xml:space="preserve"> + </w:t>
-            </w:r>
-            <w:proofErr w:type="spellStart"/>
-            <w:r>
-              <w:t>EditUserModal.tsx</w:t>
-            </w:r>
-            <w:proofErr w:type="spellEnd"/>
-          </w:p>
-        </w:tc>
-      </w:tr>
-      <w:tr>
-        <w:tc>
-          <w:tcPr>
-            <w:tcW w:w="1535" w:type="dxa"/>
-            <w:tcBorders>
-              <w:bottom w:val="single" w:sz="4" w:space="0" w:color="D3D1C7"/>
-            </w:tcBorders>
-            <w:shd w:val="clear" w:color="auto" w:fill="F1EFE8"/>
-            <w:vAlign w:val="center"/>
-            <w:hideMark/>
-          </w:tcPr>
-          <w:p>
-            <w:pPr>
-              <w:jc w:val="center"/>
-            </w:pPr>
-            <w:r>
-              <w:rPr>
-                <w:b/>
-                <w:bCs/>
-              </w:rPr>
-              <w:t xml:space="preserve">Explicitní </w:t>
-            </w:r>
-            <w:proofErr w:type="spellStart"/>
-            <w:r>
-              <w:rPr>
-                <w:b/>
-                <w:bCs/>
-              </w:rPr>
-              <w:t>props</w:t>
-            </w:r>
-            <w:proofErr w:type="spellEnd"/>
-            <w:r>
-              <w:rPr>
-                <w:b/>
-                <w:bCs/>
-              </w:rPr>
-              <w:t xml:space="preserve"> typy</w:t>
-            </w:r>
-          </w:p>
-        </w:tc>
-        <w:tc>
-          <w:tcPr>
-            <w:tcW w:w="0" w:type="auto"/>
-            <w:tcBorders>
-              <w:bottom w:val="single" w:sz="4" w:space="0" w:color="D3D1C7"/>
-            </w:tcBorders>
-            <w:shd w:val="clear" w:color="auto" w:fill="F1EFE8"/>
-            <w:vAlign w:val="center"/>
-            <w:hideMark/>
-          </w:tcPr>
-          <w:p>
-            <w:pPr>
-              <w:jc w:val="center"/>
-            </w:pPr>
-            <w:proofErr w:type="spellStart"/>
-            <w:r>
-              <w:t>function</w:t>
-            </w:r>
-            <w:proofErr w:type="spellEnd"/>
-            <w:r>
-              <w:t xml:space="preserve"> </w:t>
-            </w:r>
-            <w:proofErr w:type="spellStart"/>
-            <w:r>
-              <w:t>Button</w:t>
-            </w:r>
-            <w:proofErr w:type="spellEnd"/>
-            <w:r>
-              <w:t>(</w:t>
-            </w:r>
-            <w:proofErr w:type="spellStart"/>
-            <w:r>
-              <w:t>props</w:t>
-            </w:r>
-            <w:proofErr w:type="spellEnd"/>
-            <w:r>
-              <w:t>: any)</w:t>
             </w:r>
           </w:p>
         </w:tc>
@@ -1217,37 +884,8 @@
             <w:pPr>
               <w:jc w:val="center"/>
             </w:pPr>
-            <w:proofErr w:type="spellStart"/>
             <w:r>
-              <w:t>function</w:t>
-            </w:r>
-            <w:proofErr w:type="spellEnd"/>
-            <w:r>
-              <w:t xml:space="preserve"> </w:t>
-            </w:r>
-            <w:proofErr w:type="spellStart"/>
-            <w:r>
-              <w:t>Button</w:t>
-            </w:r>
-            <w:proofErr w:type="spellEnd"/>
-            <w:r>
-              <w:t xml:space="preserve">({ label, </w:t>
-            </w:r>
-            <w:proofErr w:type="spellStart"/>
-            <w:r>
-              <w:t>onClick</w:t>
-            </w:r>
-            <w:proofErr w:type="spellEnd"/>
-            <w:r>
-              <w:t xml:space="preserve"> }: </w:t>
-            </w:r>
-            <w:proofErr w:type="spellStart"/>
-            <w:r>
-              <w:t>ButtonProps</w:t>
-            </w:r>
-            <w:proofErr w:type="spellEnd"/>
-            <w:r>
-              <w:t>)</w:t>
+              <w:t>UserCard.tsx + EditUserModal.tsx</w:t>
             </w:r>
           </w:p>
         </w:tc>
@@ -1272,33 +910,71 @@
                 <w:b/>
                 <w:bCs/>
               </w:rPr>
-              <w:t xml:space="preserve">Vyhněte se </w:t>
+              <w:t>Explicitní props typy</w:t>
             </w:r>
-            <w:proofErr w:type="spellStart"/>
+          </w:p>
+        </w:tc>
+        <w:tc>
+          <w:tcPr>
+            <w:tcW w:w="0" w:type="auto"/>
+            <w:tcBorders>
+              <w:bottom w:val="single" w:sz="4" w:space="0" w:color="D3D1C7"/>
+            </w:tcBorders>
+            <w:shd w:val="clear" w:color="auto" w:fill="F1EFE8"/>
+            <w:vAlign w:val="center"/>
+            <w:hideMark/>
+          </w:tcPr>
+          <w:p>
+            <w:pPr>
+              <w:jc w:val="center"/>
+            </w:pPr>
+            <w:r>
+              <w:t>function Button(props: any)</w:t>
+            </w:r>
+          </w:p>
+        </w:tc>
+        <w:tc>
+          <w:tcPr>
+            <w:tcW w:w="5104" w:type="dxa"/>
+            <w:tcBorders>
+              <w:bottom w:val="single" w:sz="4" w:space="0" w:color="D3D1C7"/>
+            </w:tcBorders>
+            <w:shd w:val="clear" w:color="auto" w:fill="F1EFE8"/>
+            <w:vAlign w:val="center"/>
+            <w:hideMark/>
+          </w:tcPr>
+          <w:p>
+            <w:pPr>
+              <w:jc w:val="center"/>
+            </w:pPr>
+            <w:r>
+              <w:t>function Button({ label, onClick }: ButtonProps)</w:t>
+            </w:r>
+          </w:p>
+        </w:tc>
+      </w:tr>
+      <w:tr>
+        <w:tc>
+          <w:tcPr>
+            <w:tcW w:w="1535" w:type="dxa"/>
+            <w:tcBorders>
+              <w:bottom w:val="single" w:sz="4" w:space="0" w:color="D3D1C7"/>
+            </w:tcBorders>
+            <w:shd w:val="clear" w:color="auto" w:fill="F1EFE8"/>
+            <w:vAlign w:val="center"/>
+            <w:hideMark/>
+          </w:tcPr>
+          <w:p>
+            <w:pPr>
+              <w:jc w:val="center"/>
+            </w:pPr>
             <w:r>
               <w:rPr>
                 <w:b/>
                 <w:bCs/>
               </w:rPr>
-              <w:t>prop</w:t>
+              <w:t>Vyhněte se prop drillingu</w:t>
             </w:r>
-            <w:proofErr w:type="spellEnd"/>
-            <w:r>
-              <w:rPr>
-                <w:b/>
-                <w:bCs/>
-              </w:rPr>
-              <w:t xml:space="preserve"> </w:t>
-            </w:r>
-            <w:proofErr w:type="spellStart"/>
-            <w:r>
-              <w:rPr>
-                <w:b/>
-                <w:bCs/>
-              </w:rPr>
-              <w:t>drillingu</w:t>
-            </w:r>
-            <w:proofErr w:type="spellEnd"/>
           </w:p>
         </w:tc>
         <w:tc>
@@ -1334,19 +1010,9 @@
             <w:pPr>
               <w:jc w:val="center"/>
             </w:pPr>
-            <w:proofErr w:type="spellStart"/>
             <w:r>
-              <w:t>Context</w:t>
+              <w:t>Context API nebo Zustand</w:t>
             </w:r>
-            <w:proofErr w:type="spellEnd"/>
-            <w:r>
-              <w:t xml:space="preserve"> API nebo </w:t>
-            </w:r>
-            <w:proofErr w:type="spellStart"/>
-            <w:r>
-              <w:t>Zustand</w:t>
-            </w:r>
-            <w:proofErr w:type="spellEnd"/>
           </w:p>
         </w:tc>
       </w:tr>
@@ -1428,21 +1094,12 @@
             <w:pPr>
               <w:jc w:val="center"/>
             </w:pPr>
-            <w:proofErr w:type="spellStart"/>
             <w:r>
               <w:rPr>
                 <w:b/>
                 <w:bCs/>
               </w:rPr>
-              <w:t>Hooky</w:t>
-            </w:r>
-            <w:proofErr w:type="spellEnd"/>
-            <w:r>
-              <w:rPr>
-                <w:b/>
-                <w:bCs/>
-              </w:rPr>
-              <w:t xml:space="preserve"> pro logiku</w:t>
+              <w:t>Hooky pro logiku</w:t>
             </w:r>
           </w:p>
         </w:tc>
@@ -1480,21 +1137,8 @@
               <w:jc w:val="center"/>
             </w:pPr>
             <w:r>
-              <w:t xml:space="preserve">Přesunout do </w:t>
+              <w:t>Přesunout do custom hooku</w:t>
             </w:r>
-            <w:proofErr w:type="spellStart"/>
-            <w:r>
-              <w:t>custom</w:t>
-            </w:r>
-            <w:proofErr w:type="spellEnd"/>
-            <w:r>
-              <w:t xml:space="preserve"> </w:t>
-            </w:r>
-            <w:proofErr w:type="spellStart"/>
-            <w:r>
-              <w:t>hooku</w:t>
-            </w:r>
-            <w:proofErr w:type="spellEnd"/>
           </w:p>
         </w:tc>
       </w:tr>
@@ -1503,12 +1147,10 @@
       <w:pPr>
         <w:pStyle w:val="Nadpis1"/>
       </w:pPr>
-      <w:proofErr w:type="spellStart"/>
       <w:r>
         <w:lastRenderedPageBreak/>
         <w:t>Rendering</w:t>
       </w:r>
-      <w:proofErr w:type="spellEnd"/>
     </w:p>
     <w:p>
       <w:pPr>
@@ -1726,15 +1368,7 @@
     </w:p>
     <w:p>
       <w:r>
-        <w:t xml:space="preserve">Komponenta je samostatná část uživatelského rozhraní. Může to být tlačítko, karta filmu, formulář, navigace nebo celá stránka. V </w:t>
-      </w:r>
-      <w:proofErr w:type="spellStart"/>
-      <w:r>
-        <w:t>Reactu</w:t>
-      </w:r>
-      <w:proofErr w:type="spellEnd"/>
-      <w:r>
-        <w:t xml:space="preserve"> komponentu většinou píšeme jako funkci, která vrací JSX. JSX je zápis podobný HTML, ale ve skutečnosti je to JavaScript. Díky JSX můžeme jednoduše popsat, co se má zobrazit na stránce, a zároveň v tom používat proměnné, podmínky nebo funkce.</w:t>
+        <w:t>Komponenta je samostatná část uživatelského rozhraní. Může to být tlačítko, karta filmu, formulář, navigace nebo celá stránka. V Reactu komponentu většinou píšeme jako funkci, která vrací JSX. JSX je zápis podobný HTML, ale ve skutečnosti je to JavaScript. Díky JSX můžeme jednoduše popsat, co se má zobrazit na stránce, a zároveň v tom používat proměnné, podmínky nebo funkce.</w:t>
       </w:r>
     </w:p>
     <w:p>
@@ -1783,47 +1417,13 @@
       <w:pPr>
         <w:pStyle w:val="Nadpis2"/>
       </w:pPr>
-      <w:proofErr w:type="spellStart"/>
-      <w:r>
-        <w:t>Props</w:t>
-      </w:r>
-      <w:proofErr w:type="spellEnd"/>
-      <w:r>
-        <w:t xml:space="preserve"> komponenty</w:t>
-      </w:r>
-    </w:p>
-    <w:p>
-      <w:proofErr w:type="spellStart"/>
-      <w:r>
-        <w:t>Props</w:t>
-      </w:r>
-      <w:proofErr w:type="spellEnd"/>
-      <w:r>
-        <w:t xml:space="preserve"> jsou hodnoty, které předáváme komponentě zvenku. Fungují podobně jako parametry funkce. Rodičovská komponenta pošle data dítěti a dítě je použije pro vykreslení. </w:t>
-      </w:r>
-      <w:proofErr w:type="spellStart"/>
-      <w:r>
-        <w:t>Props</w:t>
-      </w:r>
-      <w:proofErr w:type="spellEnd"/>
-      <w:r>
-        <w:t xml:space="preserve"> jsou </w:t>
-      </w:r>
-      <w:proofErr w:type="spellStart"/>
-      <w:r>
-        <w:t>read</w:t>
-      </w:r>
-      <w:proofErr w:type="spellEnd"/>
-      <w:r>
-        <w:t xml:space="preserve">-only, což znamená, že je komponenta nemá uvnitř měnit. Pokud chceme změnit data v aplikaci, řešíme to přes stav nebo přes funkci, kterou komponentě předáme také jako </w:t>
-      </w:r>
-      <w:proofErr w:type="spellStart"/>
-      <w:r>
-        <w:t>prop</w:t>
-      </w:r>
-      <w:proofErr w:type="spellEnd"/>
-      <w:r>
-        <w:t>.</w:t>
+      <w:r>
+        <w:t>Props komponenty</w:t>
+      </w:r>
+    </w:p>
+    <w:p>
+      <w:r>
+        <w:t>Props jsou hodnoty, které předáváme komponentě zvenku. Fungují podobně jako parametry funkce. Rodičovská komponenta pošle data dítěti a dítě je použije pro vykreslení. Props jsou read-only, což znamená, že je komponenta nemá uvnitř měnit. Pokud chceme změnit data v aplikaci, řešíme to přes stav nebo přes funkci, kterou komponentě předáme také jako prop.</w:t>
       </w:r>
     </w:p>
     <w:p>
@@ -1873,36 +1473,13 @@
       <w:pPr>
         <w:pStyle w:val="Nadpis2"/>
       </w:pPr>
-      <w:proofErr w:type="spellStart"/>
-      <w:r>
-        <w:t>Composition</w:t>
-      </w:r>
-      <w:proofErr w:type="spellEnd"/>
-      <w:r>
-        <w:t xml:space="preserve"> </w:t>
-      </w:r>
-      <w:proofErr w:type="spellStart"/>
-      <w:r>
-        <w:t>pattern</w:t>
-      </w:r>
-      <w:proofErr w:type="spellEnd"/>
-    </w:p>
-    <w:p>
-      <w:proofErr w:type="spellStart"/>
-      <w:r>
-        <w:t>Composition</w:t>
-      </w:r>
-      <w:proofErr w:type="spellEnd"/>
-      <w:r>
-        <w:t xml:space="preserve"> znamená skládání většího celku z menších částí. V </w:t>
-      </w:r>
-      <w:proofErr w:type="spellStart"/>
-      <w:r>
-        <w:t>Reactu</w:t>
-      </w:r>
-      <w:proofErr w:type="spellEnd"/>
-      <w:r>
-        <w:t xml:space="preserve"> se místo jedné obří komponenty snažíme vytvářet více menších komponent, z nichž každá má jasný úkol. Například stránka uživatele se může skládat z hlavičky, statistik a seznamu aktivit. Díky tomu je kód přehlednější, lépe se upravuje a jednotlivé komponenty můžeme použít znovu na více místech.</w:t>
+      <w:r>
+        <w:t>Composition pattern</w:t>
+      </w:r>
+    </w:p>
+    <w:p>
+      <w:r>
+        <w:t>Composition znamená skládání většího celku z menších částí. V Reactu se místo jedné obří komponenty snažíme vytvářet více menších komponent, z nichž každá má jasný úkol. Například stránka uživatele se může skládat z hlavičky, statistik a seznamu aktivit. Díky tomu je kód přehlednější, lépe se upravuje a jednotlivé komponenty můžeme použít znovu na více místech.</w:t>
       </w:r>
     </w:p>
     <w:p>
@@ -1951,40 +1528,14 @@
       <w:pPr>
         <w:pStyle w:val="Nadpis1"/>
       </w:pPr>
-      <w:proofErr w:type="spellStart"/>
       <w:r>
         <w:lastRenderedPageBreak/>
         <w:t>Hooks</w:t>
       </w:r>
-      <w:proofErr w:type="spellEnd"/>
-    </w:p>
-    <w:p>
-      <w:r>
-        <w:t xml:space="preserve">Funkce, které umožňují </w:t>
-      </w:r>
-      <w:proofErr w:type="spellStart"/>
-      <w:r>
-        <w:t>komponenám</w:t>
-      </w:r>
-      <w:proofErr w:type="spellEnd"/>
-      <w:r>
-        <w:t xml:space="preserve"> využívat </w:t>
-      </w:r>
-      <w:proofErr w:type="spellStart"/>
-      <w:r>
-        <w:t>React</w:t>
-      </w:r>
-      <w:proofErr w:type="spellEnd"/>
-      <w:r>
-        <w:t xml:space="preserve"> </w:t>
-      </w:r>
-      <w:proofErr w:type="spellStart"/>
-      <w:r>
-        <w:t>featury</w:t>
-      </w:r>
-      <w:proofErr w:type="spellEnd"/>
-      <w:r>
-        <w:t>.</w:t>
+    </w:p>
+    <w:p>
+      <w:r>
+        <w:t>Funkce, které umožňují komponenám využívat React featury.</w:t>
       </w:r>
     </w:p>
     <w:p>
@@ -1996,19 +1547,9 @@
       <w:pPr>
         <w:pStyle w:val="Nadpis2"/>
       </w:pPr>
-      <w:proofErr w:type="spellStart"/>
-      <w:r>
-        <w:t>Lifecycle</w:t>
-      </w:r>
-      <w:proofErr w:type="spellEnd"/>
-      <w:r>
-        <w:t xml:space="preserve"> </w:t>
-      </w:r>
-      <w:proofErr w:type="spellStart"/>
-      <w:r>
-        <w:t>componenty</w:t>
-      </w:r>
-      <w:proofErr w:type="spellEnd"/>
+      <w:r>
+        <w:t>Lifecycle componenty</w:t>
+      </w:r>
     </w:p>
     <w:p>
       <w:pPr>
@@ -2020,26 +1561,16 @@
     </w:p>
     <w:p>
       <w:r>
-        <w:t xml:space="preserve">Komponenta se </w:t>
-      </w:r>
-      <w:proofErr w:type="spellStart"/>
-      <w:r>
-        <w:t>distabe</w:t>
-      </w:r>
-      <w:proofErr w:type="spellEnd"/>
-      <w:r>
-        <w:t xml:space="preserve"> do DOM</w:t>
+        <w:t>Komponenta se distabe do DOM</w:t>
       </w:r>
     </w:p>
     <w:p>
       <w:pPr>
         <w:pStyle w:val="Nadpis3"/>
       </w:pPr>
-      <w:proofErr w:type="spellStart"/>
       <w:r>
         <w:t>Render</w:t>
       </w:r>
-      <w:proofErr w:type="spellEnd"/>
     </w:p>
     <w:p/>
     <w:p>
@@ -2055,11 +1586,9 @@
       <w:pPr>
         <w:pStyle w:val="Nadpis3"/>
       </w:pPr>
-      <w:proofErr w:type="spellStart"/>
       <w:r>
         <w:t>Unmount</w:t>
       </w:r>
-      <w:proofErr w:type="spellEnd"/>
     </w:p>
     <w:p>
       <w:r>
@@ -2070,11 +1599,9 @@
       <w:pPr>
         <w:pStyle w:val="Nadpis2"/>
       </w:pPr>
-      <w:proofErr w:type="spellStart"/>
       <w:r>
         <w:t>UseState</w:t>
       </w:r>
-      <w:proofErr w:type="spellEnd"/>
     </w:p>
     <w:p>
       <w:r>
@@ -2085,55 +1612,22 @@
       <w:pPr>
         <w:pStyle w:val="Nadpis2"/>
       </w:pPr>
-      <w:proofErr w:type="spellStart"/>
       <w:r>
         <w:t>UseEffect</w:t>
       </w:r>
-      <w:proofErr w:type="spellEnd"/>
-    </w:p>
-    <w:p>
-      <w:r>
-        <w:t xml:space="preserve">Používá se pro kód, který má proběhnout až </w:t>
-      </w:r>
-      <w:proofErr w:type="spellStart"/>
-      <w:r>
-        <w:t>pootm</w:t>
-      </w:r>
-      <w:proofErr w:type="spellEnd"/>
-      <w:r>
-        <w:t xml:space="preserve">, co je </w:t>
-      </w:r>
-      <w:proofErr w:type="spellStart"/>
-      <w:r>
-        <w:t>komponentea</w:t>
-      </w:r>
-      <w:proofErr w:type="spellEnd"/>
-      <w:r>
-        <w:t xml:space="preserve"> vykreslena nebo když s ní chceme pracovat v rámci </w:t>
-      </w:r>
-      <w:proofErr w:type="spellStart"/>
-      <w:r>
-        <w:t>lifecycle</w:t>
-      </w:r>
-      <w:proofErr w:type="spellEnd"/>
+    </w:p>
+    <w:p>
+      <w:r>
+        <w:t>Používá se pro kód, který má proběhnout až pootm, co je komponentea vykreslena nebo když s ní chceme pracovat v rámci lifecycle</w:t>
+      </w:r>
     </w:p>
     <w:p>
       <w:pPr>
         <w:pStyle w:val="Nadpis3"/>
       </w:pPr>
-      <w:proofErr w:type="spellStart"/>
-      <w:r>
-        <w:t>Side</w:t>
-      </w:r>
-      <w:proofErr w:type="spellEnd"/>
-      <w:r>
-        <w:t xml:space="preserve"> </w:t>
-      </w:r>
-      <w:proofErr w:type="spellStart"/>
-      <w:r>
-        <w:t>effecty</w:t>
-      </w:r>
-      <w:proofErr w:type="spellEnd"/>
+      <w:r>
+        <w:t>Side effecty</w:t>
+      </w:r>
     </w:p>
     <w:p>
       <w:r>
@@ -2144,76 +1638,36 @@
       <w:pPr>
         <w:pStyle w:val="Nadpis2"/>
       </w:pPr>
-      <w:proofErr w:type="spellStart"/>
       <w:r>
         <w:t>useRef</w:t>
       </w:r>
-      <w:proofErr w:type="spellEnd"/>
     </w:p>
     <w:p>
       <w:pPr>
         <w:pStyle w:val="Nadpis2"/>
       </w:pPr>
-      <w:proofErr w:type="spellStart"/>
       <w:r>
         <w:t>useMemo</w:t>
       </w:r>
-      <w:proofErr w:type="spellEnd"/>
     </w:p>
     <w:p>
       <w:pPr>
         <w:pStyle w:val="Nadpis2"/>
       </w:pPr>
-      <w:proofErr w:type="spellStart"/>
-      <w:r>
-        <w:t>Custom</w:t>
-      </w:r>
-      <w:proofErr w:type="spellEnd"/>
-      <w:r>
-        <w:t xml:space="preserve"> </w:t>
-      </w:r>
-      <w:proofErr w:type="spellStart"/>
-      <w:r>
-        <w:t>hooks</w:t>
-      </w:r>
-      <w:proofErr w:type="spellEnd"/>
-    </w:p>
-    <w:p>
-      <w:proofErr w:type="spellStart"/>
-      <w:r>
-        <w:t>Custom</w:t>
-      </w:r>
-      <w:proofErr w:type="spellEnd"/>
-      <w:r>
-        <w:t xml:space="preserve"> </w:t>
-      </w:r>
-      <w:proofErr w:type="spellStart"/>
-      <w:r>
-        <w:t>hook</w:t>
-      </w:r>
-      <w:proofErr w:type="spellEnd"/>
-      <w:r>
-        <w:t xml:space="preserve"> je vlastní funkce, která začíná slovem use a může uvnitř používat jiné </w:t>
-      </w:r>
-      <w:proofErr w:type="spellStart"/>
-      <w:r>
-        <w:t>hooky</w:t>
-      </w:r>
-      <w:proofErr w:type="spellEnd"/>
-      <w:r>
-        <w:t xml:space="preserve">. Slouží k tomu, abychom logiku nemuseli opakovat ve více komponentách. Logika znamená pravidla a chování aplikace, například práce s formulářem, </w:t>
-      </w:r>
-      <w:proofErr w:type="spellStart"/>
-      <w:r>
-        <w:t>localStorage</w:t>
-      </w:r>
-      <w:proofErr w:type="spellEnd"/>
-      <w:r>
-        <w:t xml:space="preserve"> nebo načítáním dat. Komponenta pak zůstane přehlednější, protože se víc soustředí na zobrazení.</w:t>
-      </w:r>
-    </w:p>
-    <w:p>
-      <w:r>
+      <w:r>
+        <w:t>Custom hooks</w:t>
+      </w:r>
+    </w:p>
+    <w:p>
+      <w:r>
+        <w:t>Custom hook je vlastní funkce, která začíná slovem use a může uvnitř používat jiné hooky. Slouží k tomu, abychom logiku nemuseli opakovat ve více komponentách. Logika znamená pravidla a chování aplikace, například práce s formulářem, localStorage nebo načítáním dat. Komponenta pak zůstane přehlednější, protože se víc soustředí na zobrazení.</w:t>
+      </w:r>
+    </w:p>
+    <w:p>
+      <w:r>
+        <w:rPr>
+          <w:noProof/>
+        </w:rPr>
         <w:lastRenderedPageBreak/>
         <w:drawing>
           <wp:inline distT="0" distB="0" distL="0" distR="0" wp14:anchorId="1491525E" wp14:editId="26118AEF">
@@ -2262,26 +1716,52 @@
     </w:p>
     <w:p>
       <w:r>
-        <w:t>V malé komponentě je práce se stavem jednoduchá: komponenta si hodnotu uloží přes </w:t>
-      </w:r>
-      <w:proofErr w:type="spellStart"/>
-      <w:r>
-        <w:t>useState</w:t>
-      </w:r>
-      <w:proofErr w:type="spellEnd"/>
-      <w:r>
-        <w:t xml:space="preserve"> a sama ji také mění. U větší aplikace ale často nastane otázka, kde mají data vlastně bydlet. Když stejná data potřebuje více komponent, není dobré je kopírovat na více míst. Místo toho hledáme jedno společné místo, odkud se data čtou a kde se také mění. Právě tomu říkáme </w:t>
-      </w:r>
-      <w:proofErr w:type="spellStart"/>
-      <w:r>
-        <w:t>state</w:t>
-      </w:r>
-      <w:proofErr w:type="spellEnd"/>
-      <w:r>
-        <w:t xml:space="preserve"> management. Cílem není použít co nejsložitější nástroj, ale zvolit nejjednodušší řešení, které je pro danou situaci přehledné.</w:t>
-      </w:r>
-    </w:p>
-    <w:p/>
+        <w:t>V malé komponentě je práce se stavem jednoduchá: komponenta si hodnotu uloží přes useState a sama ji také mění. U větší aplikace ale často nastane otázka, kde mají data vlastně bydlet. Když stejná data potřebuje více komponent, není dobré je kopírovat na více míst. Místo toho hledáme jedno společné místo, odkud se data čtou a kde se také mění. Právě tomu říkáme state management. Cílem není použít co nejsložitější nástroj, ale zvolit nejjednodušší řešení, které je pro danou situaci přehledné.</w:t>
+      </w:r>
+    </w:p>
+    <w:p>
+      <w:pPr>
+        <w:pStyle w:val="Nadpis1"/>
+      </w:pPr>
+      <w:r>
+        <w:t>Routing</w:t>
+      </w:r>
+    </w:p>
+    <w:p>
+      <w:r>
+        <w:t>Mapování komponenty na url</w:t>
+      </w:r>
+    </w:p>
+    <w:p>
+      <w:pPr>
+        <w:pStyle w:val="Nadpis2"/>
+      </w:pPr>
+      <w:r>
+        <w:lastRenderedPageBreak/>
+        <w:t>React router</w:t>
+      </w:r>
+    </w:p>
+    <w:p>
+      <w:pPr>
+        <w:pStyle w:val="Nadpis2"/>
+      </w:pPr>
+      <w:r>
+        <w:t>Search params</w:t>
+      </w:r>
+    </w:p>
+    <w:p>
+      <w:pPr>
+        <w:pStyle w:val="Nadpis2"/>
+      </w:pPr>
+      <w:r>
+        <w:t>Browser router</w:t>
+      </w:r>
+    </w:p>
+    <w:p>
+      <w:pPr>
+        <w:pStyle w:val="Nadpis2"/>
+      </w:pPr>
+    </w:p>
     <w:sectPr>
       <w:headerReference w:type="default" r:id="rId21"/>
       <w:pgSz w:w="11906" w:h="16838"/>
@@ -4191,6 +3671,7 @@
   <w:style w:type="character" w:default="1" w:styleId="Standardnpsmoodstavce">
     <w:name w:val="Default Paragraph Font"/>
     <w:uiPriority w:val="1"/>
+    <w:semiHidden/>
     <w:unhideWhenUsed/>
   </w:style>
   <w:style w:type="table" w:default="1" w:styleId="Normlntabulka">

</xml_diff>